<commit_message>
added requirements FA / NFA / Constraints
</commit_message>
<xml_diff>
--- a/TurboTicketTornado/SWD-Project-Template.docx
+++ b/TurboTicketTornado/SWD-Project-Template.docx
@@ -2800,11 +2800,19 @@
         </w:rPr>
       </w:pPr>
       <w:bookmarkStart w:id="6" w:name="_Toc207788672"/>
-      <w:r>
-        <w:rPr>
-          <w:rFonts w:asciiTheme="minorHAnsi" w:hAnsiTheme="minorHAnsi" w:cstheme="minorHAnsi"/>
-        </w:rPr>
-        <w:t xml:space="preserve">No Project </w:t>
+      <w:proofErr w:type="spellStart"/>
+      <w:r>
+        <w:rPr>
+          <w:rFonts w:asciiTheme="minorHAnsi" w:hAnsiTheme="minorHAnsi" w:cstheme="minorHAnsi"/>
+        </w:rPr>
+        <w:t>No</w:t>
+      </w:r>
+      <w:proofErr w:type="spellEnd"/>
+      <w:r>
+        <w:rPr>
+          <w:rFonts w:asciiTheme="minorHAnsi" w:hAnsiTheme="minorHAnsi" w:cstheme="minorHAnsi"/>
+        </w:rPr>
+        <w:t xml:space="preserve"> Project </w:t>
       </w:r>
       <w:proofErr w:type="spellStart"/>
       <w:r>
@@ -3067,27 +3075,116 @@
     </w:p>
     <w:p>
       <w:pPr>
-        <w:rPr>
+        <w:numPr>
+          <w:ilvl w:val="0"/>
+          <w:numId w:val="23"/>
+        </w:numPr>
+        <w:rPr>
+          <w:rFonts w:asciiTheme="minorHAnsi" w:hAnsiTheme="minorHAnsi" w:cstheme="minorHAnsi"/>
           <w:lang w:val="en-GB"/>
         </w:rPr>
       </w:pPr>
       <w:r>
         <w:rPr>
+          <w:rFonts w:asciiTheme="minorHAnsi" w:hAnsiTheme="minorHAnsi" w:cstheme="minorHAnsi"/>
           <w:lang w:val="en-GB"/>
         </w:rPr>
-        <w:t>The projects requirements do</w:t>
-      </w:r>
-      <w:r>
-        <w:rPr>
+        <w:t xml:space="preserve">The system shall allow regular customers and season ticket holders to purchase or reserve a maximum of 4 tickets per person. </w:t>
+      </w:r>
+    </w:p>
+    <w:p>
+      <w:pPr>
+        <w:numPr>
+          <w:ilvl w:val="0"/>
+          <w:numId w:val="23"/>
+        </w:numPr>
+        <w:rPr>
+          <w:rFonts w:asciiTheme="minorHAnsi" w:hAnsiTheme="minorHAnsi" w:cstheme="minorHAnsi"/>
           <w:lang w:val="en-GB"/>
         </w:rPr>
-        <w:t>cument a</w:t>
-      </w:r>
-      <w:r>
-        <w:rPr>
+      </w:pPr>
+      <w:r>
+        <w:rPr>
+          <w:rFonts w:asciiTheme="minorHAnsi" w:hAnsiTheme="minorHAnsi" w:cstheme="minorHAnsi"/>
           <w:lang w:val="en-GB"/>
         </w:rPr>
-        <w:t>lready describes the functional requirements.</w:t>
+        <w:t xml:space="preserve">The system must allow the cancellation of reserved tickets by customers or authorized staff. </w:t>
+      </w:r>
+    </w:p>
+    <w:p>
+      <w:pPr>
+        <w:numPr>
+          <w:ilvl w:val="0"/>
+          <w:numId w:val="23"/>
+        </w:numPr>
+        <w:rPr>
+          <w:rFonts w:asciiTheme="minorHAnsi" w:hAnsiTheme="minorHAnsi" w:cstheme="minorHAnsi"/>
+          <w:lang w:val="en-GB"/>
+        </w:rPr>
+      </w:pPr>
+      <w:r>
+        <w:rPr>
+          <w:rFonts w:asciiTheme="minorHAnsi" w:hAnsiTheme="minorHAnsi" w:cstheme="minorHAnsi"/>
+          <w:lang w:val="en-GB"/>
+        </w:rPr>
+        <w:t xml:space="preserve">The system shall support multiple payment methods, specifically cash (only at staffed stalls) and credit card (online or at POS). </w:t>
+      </w:r>
+    </w:p>
+    <w:p>
+      <w:pPr>
+        <w:numPr>
+          <w:ilvl w:val="0"/>
+          <w:numId w:val="23"/>
+        </w:numPr>
+        <w:rPr>
+          <w:rFonts w:asciiTheme="minorHAnsi" w:hAnsiTheme="minorHAnsi" w:cstheme="minorHAnsi"/>
+          <w:lang w:val="en-GB"/>
+        </w:rPr>
+      </w:pPr>
+      <w:r>
+        <w:rPr>
+          <w:rFonts w:asciiTheme="minorHAnsi" w:hAnsiTheme="minorHAnsi" w:cstheme="minorHAnsi"/>
+          <w:lang w:val="en-GB"/>
+        </w:rPr>
+        <w:t xml:space="preserve">Clients (POS, web, kiosk, app) must be able to independently query the server for available seats within specific sections and request billing information for transactions. </w:t>
+      </w:r>
+    </w:p>
+    <w:p>
+      <w:pPr>
+        <w:numPr>
+          <w:ilvl w:val="0"/>
+          <w:numId w:val="23"/>
+        </w:numPr>
+        <w:rPr>
+          <w:rFonts w:asciiTheme="minorHAnsi" w:hAnsiTheme="minorHAnsi" w:cstheme="minorHAnsi"/>
+          <w:lang w:val="en-GB"/>
+        </w:rPr>
+      </w:pPr>
+      <w:r>
+        <w:rPr>
+          <w:rFonts w:asciiTheme="minorHAnsi" w:hAnsiTheme="minorHAnsi" w:cstheme="minorHAnsi"/>
+          <w:lang w:val="en-GB"/>
+        </w:rPr>
+        <w:t xml:space="preserve">The central server must provide the real-time status of seats (free, reserved, sold) and calculate utilization statistics over selectable periods (e.g., single match, full season). </w:t>
+      </w:r>
+    </w:p>
+    <w:p>
+      <w:pPr>
+        <w:numPr>
+          <w:ilvl w:val="0"/>
+          <w:numId w:val="23"/>
+        </w:numPr>
+        <w:rPr>
+          <w:rFonts w:asciiTheme="minorHAnsi" w:hAnsiTheme="minorHAnsi" w:cstheme="minorHAnsi"/>
+          <w:lang w:val="en-GB"/>
+        </w:rPr>
+      </w:pPr>
+      <w:r>
+        <w:rPr>
+          <w:rFonts w:asciiTheme="minorHAnsi" w:hAnsiTheme="minorHAnsi" w:cstheme="minorHAnsi"/>
+          <w:lang w:val="en-GB"/>
+        </w:rPr>
+        <w:t xml:space="preserve">The system must record every stadium entry scan and grant access only if the ticket is valid for the currently active match and has not been used before. </w:t>
       </w:r>
     </w:p>
     <w:p>
@@ -3130,44 +3227,319 @@
     </w:p>
     <w:p>
       <w:pPr>
-        <w:pStyle w:val="berschrift4"/>
-        <w:rPr>
-          <w:rFonts w:asciiTheme="minorHAnsi" w:hAnsiTheme="minorHAnsi" w:cstheme="minorHAnsi"/>
-        </w:rPr>
-      </w:pPr>
-      <w:r>
-        <w:rPr>
-          <w:rFonts w:asciiTheme="minorHAnsi" w:hAnsiTheme="minorHAnsi" w:cstheme="minorHAnsi"/>
-        </w:rPr>
-        <w:t xml:space="preserve">Quality </w:t>
-      </w:r>
-      <w:proofErr w:type="spellStart"/>
-      <w:r>
-        <w:rPr>
-          <w:rFonts w:asciiTheme="minorHAnsi" w:hAnsiTheme="minorHAnsi" w:cstheme="minorHAnsi"/>
-        </w:rPr>
-        <w:t>requirements</w:t>
-      </w:r>
-      <w:proofErr w:type="spellEnd"/>
+        <w:numPr>
+          <w:ilvl w:val="0"/>
+          <w:numId w:val="24"/>
+        </w:numPr>
+        <w:rPr>
+          <w:rFonts w:asciiTheme="minorHAnsi" w:hAnsiTheme="minorHAnsi" w:cstheme="minorHAnsi"/>
+          <w:lang w:val="en-GB"/>
+        </w:rPr>
+      </w:pPr>
+      <w:r>
+        <w:rPr>
+          <w:rFonts w:asciiTheme="minorHAnsi" w:hAnsiTheme="minorHAnsi" w:cstheme="minorHAnsi"/>
+          <w:b/>
+          <w:bCs/>
+          <w:lang w:val="en-GB"/>
+        </w:rPr>
+        <w:t>Concurrency &amp; Data Integrity:</w:t>
+      </w:r>
+      <w:r>
+        <w:rPr>
+          <w:rFonts w:asciiTheme="minorHAnsi" w:hAnsiTheme="minorHAnsi" w:cstheme="minorHAnsi"/>
+          <w:lang w:val="en-GB"/>
+        </w:rPr>
+        <w:t xml:space="preserve"> The system must seamlessly handle simultaneous booking attempts from multiple independent clients. </w:t>
+      </w:r>
     </w:p>
     <w:p>
       <w:pPr>
-        <w:pStyle w:val="berschrift4"/>
-        <w:rPr>
-          <w:rFonts w:asciiTheme="minorHAnsi" w:hAnsiTheme="minorHAnsi" w:cstheme="minorHAnsi"/>
-        </w:rPr>
-      </w:pPr>
-      <w:r>
-        <w:rPr>
-          <w:rFonts w:asciiTheme="minorHAnsi" w:hAnsiTheme="minorHAnsi" w:cstheme="minorHAnsi"/>
-        </w:rPr>
-        <w:t>Constraints</w:t>
+        <w:numPr>
+          <w:ilvl w:val="1"/>
+          <w:numId w:val="24"/>
+        </w:numPr>
+        <w:rPr>
+          <w:rFonts w:asciiTheme="minorHAnsi" w:hAnsiTheme="minorHAnsi" w:cstheme="minorHAnsi"/>
+          <w:lang w:val="en-GB"/>
+        </w:rPr>
+      </w:pPr>
+      <w:proofErr w:type="spellStart"/>
+      <w:r>
+        <w:rPr>
+          <w:rFonts w:asciiTheme="minorHAnsi" w:hAnsiTheme="minorHAnsi" w:cstheme="minorHAnsi"/>
+          <w:i/>
+          <w:iCs/>
+          <w:lang w:val="en-GB"/>
+        </w:rPr>
+        <w:t>Measureable</w:t>
+      </w:r>
+      <w:proofErr w:type="spellEnd"/>
+      <w:r>
+        <w:rPr>
+          <w:rFonts w:asciiTheme="minorHAnsi" w:hAnsiTheme="minorHAnsi" w:cstheme="minorHAnsi"/>
+          <w:i/>
+          <w:iCs/>
+          <w:lang w:val="en-GB"/>
+        </w:rPr>
+        <w:t xml:space="preserve"> Goal:</w:t>
+      </w:r>
+      <w:r>
+        <w:rPr>
+          <w:rFonts w:asciiTheme="minorHAnsi" w:hAnsiTheme="minorHAnsi" w:cstheme="minorHAnsi"/>
+          <w:lang w:val="en-GB"/>
+        </w:rPr>
+        <w:t xml:space="preserve"> 0 duplicate seat assignments or </w:t>
+      </w:r>
+      <w:proofErr w:type="gramStart"/>
+      <w:r>
+        <w:rPr>
+          <w:rFonts w:asciiTheme="minorHAnsi" w:hAnsiTheme="minorHAnsi" w:cstheme="minorHAnsi"/>
+          <w:lang w:val="en-GB"/>
+        </w:rPr>
+        <w:t>double-bookings</w:t>
+      </w:r>
+      <w:proofErr w:type="gramEnd"/>
+      <w:r>
+        <w:rPr>
+          <w:rFonts w:asciiTheme="minorHAnsi" w:hAnsiTheme="minorHAnsi" w:cstheme="minorHAnsi"/>
+          <w:lang w:val="en-GB"/>
+        </w:rPr>
+        <w:t xml:space="preserve"> occur during concurrent multi-user purchase flows. </w:t>
       </w:r>
     </w:p>
     <w:p>
       <w:pPr>
-        <w:rPr>
-          <w:rFonts w:asciiTheme="minorHAnsi" w:hAnsiTheme="minorHAnsi" w:cstheme="minorHAnsi"/>
+        <w:numPr>
+          <w:ilvl w:val="0"/>
+          <w:numId w:val="24"/>
+        </w:numPr>
+        <w:rPr>
+          <w:rFonts w:asciiTheme="minorHAnsi" w:hAnsiTheme="minorHAnsi" w:cstheme="minorHAnsi"/>
+          <w:lang w:val="en-GB"/>
+        </w:rPr>
+      </w:pPr>
+      <w:r>
+        <w:rPr>
+          <w:rFonts w:asciiTheme="minorHAnsi" w:hAnsiTheme="minorHAnsi" w:cstheme="minorHAnsi"/>
+          <w:b/>
+          <w:bCs/>
+          <w:lang w:val="en-GB"/>
+        </w:rPr>
+        <w:t>Testability:</w:t>
+      </w:r>
+      <w:r>
+        <w:rPr>
+          <w:rFonts w:asciiTheme="minorHAnsi" w:hAnsiTheme="minorHAnsi" w:cstheme="minorHAnsi"/>
+          <w:lang w:val="en-GB"/>
+        </w:rPr>
+        <w:t xml:space="preserve"> The software architecture must facilitate systematic validation of business logic. </w:t>
+      </w:r>
+    </w:p>
+    <w:p>
+      <w:pPr>
+        <w:numPr>
+          <w:ilvl w:val="1"/>
+          <w:numId w:val="24"/>
+        </w:numPr>
+        <w:rPr>
+          <w:rFonts w:asciiTheme="minorHAnsi" w:hAnsiTheme="minorHAnsi" w:cstheme="minorHAnsi"/>
+          <w:lang w:val="en-GB"/>
+        </w:rPr>
+      </w:pPr>
+      <w:proofErr w:type="spellStart"/>
+      <w:r>
+        <w:rPr>
+          <w:rFonts w:asciiTheme="minorHAnsi" w:hAnsiTheme="minorHAnsi" w:cstheme="minorHAnsi"/>
+          <w:i/>
+          <w:iCs/>
+          <w:lang w:val="en-GB"/>
+        </w:rPr>
+        <w:lastRenderedPageBreak/>
+        <w:t>Measureable</w:t>
+      </w:r>
+      <w:proofErr w:type="spellEnd"/>
+      <w:r>
+        <w:rPr>
+          <w:rFonts w:asciiTheme="minorHAnsi" w:hAnsiTheme="minorHAnsi" w:cstheme="minorHAnsi"/>
+          <w:i/>
+          <w:iCs/>
+          <w:lang w:val="en-GB"/>
+        </w:rPr>
+        <w:t xml:space="preserve"> Goal:</w:t>
+      </w:r>
+      <w:r>
+        <w:rPr>
+          <w:rFonts w:asciiTheme="minorHAnsi" w:hAnsiTheme="minorHAnsi" w:cstheme="minorHAnsi"/>
+          <w:lang w:val="en-GB"/>
+        </w:rPr>
+        <w:t xml:space="preserve"> 100% of critical system paths (reservation creation, capacity limits, concurrent requests, and device unlock/deny flows) are covered and validated by automated unit tests. </w:t>
+      </w:r>
+    </w:p>
+    <w:p>
+      <w:pPr>
+        <w:numPr>
+          <w:ilvl w:val="0"/>
+          <w:numId w:val="24"/>
+        </w:numPr>
+        <w:rPr>
+          <w:rFonts w:asciiTheme="minorHAnsi" w:hAnsiTheme="minorHAnsi" w:cstheme="minorHAnsi"/>
+          <w:lang w:val="en-GB"/>
+        </w:rPr>
+      </w:pPr>
+      <w:r>
+        <w:rPr>
+          <w:rFonts w:asciiTheme="minorHAnsi" w:hAnsiTheme="minorHAnsi" w:cstheme="minorHAnsi"/>
+          <w:b/>
+          <w:bCs/>
+          <w:lang w:val="en-GB"/>
+        </w:rPr>
+        <w:t>Interoperability (Client Independence):</w:t>
+      </w:r>
+      <w:r>
+        <w:rPr>
+          <w:rFonts w:asciiTheme="minorHAnsi" w:hAnsiTheme="minorHAnsi" w:cstheme="minorHAnsi"/>
+          <w:lang w:val="en-GB"/>
+        </w:rPr>
+        <w:t xml:space="preserve"> Diverse clients (web, kiosk, POS) must be loosely coupled to the ticketing backend. </w:t>
+      </w:r>
+    </w:p>
+    <w:p>
+      <w:pPr>
+        <w:numPr>
+          <w:ilvl w:val="1"/>
+          <w:numId w:val="24"/>
+        </w:numPr>
+        <w:rPr>
+          <w:rFonts w:asciiTheme="minorHAnsi" w:hAnsiTheme="minorHAnsi" w:cstheme="minorHAnsi"/>
+          <w:lang w:val="en-GB"/>
+        </w:rPr>
+      </w:pPr>
+      <w:proofErr w:type="spellStart"/>
+      <w:r>
+        <w:rPr>
+          <w:rFonts w:asciiTheme="minorHAnsi" w:hAnsiTheme="minorHAnsi" w:cstheme="minorHAnsi"/>
+          <w:i/>
+          <w:iCs/>
+          <w:lang w:val="en-GB"/>
+        </w:rPr>
+        <w:t>Measureable</w:t>
+      </w:r>
+      <w:proofErr w:type="spellEnd"/>
+      <w:r>
+        <w:rPr>
+          <w:rFonts w:asciiTheme="minorHAnsi" w:hAnsiTheme="minorHAnsi" w:cstheme="minorHAnsi"/>
+          <w:i/>
+          <w:iCs/>
+          <w:lang w:val="en-GB"/>
+        </w:rPr>
+        <w:t xml:space="preserve"> Goal:</w:t>
+      </w:r>
+      <w:r>
+        <w:rPr>
+          <w:rFonts w:asciiTheme="minorHAnsi" w:hAnsiTheme="minorHAnsi" w:cstheme="minorHAnsi"/>
+          <w:lang w:val="en-GB"/>
+        </w:rPr>
+        <w:t xml:space="preserve"> 100% of data exchange between the clients and the central server is routed exclusively through a defined API, with no direct database access from the client side. </w:t>
+      </w:r>
+    </w:p>
+    <w:p>
+      <w:pPr>
+        <w:pStyle w:val="berschrift3"/>
+      </w:pPr>
+      <w:r>
+        <w:t>Constraints</w:t>
+      </w:r>
+    </w:p>
+    <w:p>
+      <w:pPr>
+        <w:numPr>
+          <w:ilvl w:val="0"/>
+          <w:numId w:val="25"/>
+        </w:numPr>
+        <w:rPr>
+          <w:rFonts w:asciiTheme="minorHAnsi" w:hAnsiTheme="minorHAnsi" w:cstheme="minorHAnsi"/>
+          <w:lang w:val="en-GB"/>
+        </w:rPr>
+      </w:pPr>
+      <w:r>
+        <w:rPr>
+          <w:rFonts w:asciiTheme="minorHAnsi" w:hAnsiTheme="minorHAnsi" w:cstheme="minorHAnsi"/>
+          <w:b/>
+          <w:bCs/>
+          <w:lang w:val="en-GB"/>
+        </w:rPr>
+        <w:t>Architectural Constraint:</w:t>
+      </w:r>
+      <w:r>
+        <w:rPr>
+          <w:rFonts w:asciiTheme="minorHAnsi" w:hAnsiTheme="minorHAnsi" w:cstheme="minorHAnsi"/>
+          <w:lang w:val="en-GB"/>
+        </w:rPr>
+        <w:t xml:space="preserve"> The core design must strictly follow a server-centric architecture. </w:t>
+      </w:r>
+    </w:p>
+    <w:p>
+      <w:pPr>
+        <w:numPr>
+          <w:ilvl w:val="0"/>
+          <w:numId w:val="25"/>
+        </w:numPr>
+        <w:rPr>
+          <w:rFonts w:asciiTheme="minorHAnsi" w:hAnsiTheme="minorHAnsi" w:cstheme="minorHAnsi"/>
+          <w:lang w:val="en-GB"/>
+        </w:rPr>
+      </w:pPr>
+      <w:r>
+        <w:rPr>
+          <w:rFonts w:asciiTheme="minorHAnsi" w:hAnsiTheme="minorHAnsi" w:cstheme="minorHAnsi"/>
+          <w:b/>
+          <w:bCs/>
+          <w:lang w:val="en-GB"/>
+        </w:rPr>
+        <w:t>Technical Constraint:</w:t>
+      </w:r>
+      <w:r>
+        <w:rPr>
+          <w:rFonts w:asciiTheme="minorHAnsi" w:hAnsiTheme="minorHAnsi" w:cstheme="minorHAnsi"/>
+          <w:lang w:val="en-GB"/>
+        </w:rPr>
+        <w:t xml:space="preserve"> The implementation is not a greenfield project; it must be built upon the explicitly provided starter project and adhere to its chosen technology stack. </w:t>
+      </w:r>
+    </w:p>
+    <w:p>
+      <w:pPr>
+        <w:numPr>
+          <w:ilvl w:val="0"/>
+          <w:numId w:val="25"/>
+        </w:numPr>
+        <w:rPr>
+          <w:rFonts w:asciiTheme="minorHAnsi" w:hAnsiTheme="minorHAnsi" w:cstheme="minorHAnsi"/>
+          <w:lang w:val="en-GB"/>
+        </w:rPr>
+      </w:pPr>
+      <w:r>
+        <w:rPr>
+          <w:rFonts w:asciiTheme="minorHAnsi" w:hAnsiTheme="minorHAnsi" w:cstheme="minorHAnsi"/>
+          <w:b/>
+          <w:bCs/>
+          <w:lang w:val="en-GB"/>
+        </w:rPr>
+        <w:t>Scope Constraint:</w:t>
+      </w:r>
+      <w:r>
+        <w:rPr>
+          <w:rFonts w:asciiTheme="minorHAnsi" w:hAnsiTheme="minorHAnsi" w:cstheme="minorHAnsi"/>
+          <w:lang w:val="en-GB"/>
+        </w:rPr>
+        <w:t xml:space="preserve"> The implementation must strictly adhere to the explicitly assigned use cases (Single-Match Ticket Sale, Access Control, and Season Ticket Sale for a team of 3), with alternative use cases requiring prior instructor approval. </w:t>
+      </w:r>
+    </w:p>
+    <w:p>
+      <w:pPr>
+        <w:rPr>
+          <w:rFonts w:asciiTheme="minorHAnsi" w:hAnsiTheme="minorHAnsi" w:cstheme="minorHAnsi"/>
+          <w:lang w:val="en-GB"/>
         </w:rPr>
       </w:pPr>
     </w:p>
@@ -3182,11 +3554,13 @@
           <w:bCs/>
           <w:sz w:val="28"/>
           <w:szCs w:val="28"/>
-        </w:rPr>
-      </w:pPr>
-      <w:r>
-        <w:rPr>
-          <w:rFonts w:asciiTheme="minorHAnsi" w:hAnsiTheme="minorHAnsi" w:cstheme="minorHAnsi"/>
+          <w:lang w:val="en-GB"/>
+        </w:rPr>
+      </w:pPr>
+      <w:r>
+        <w:rPr>
+          <w:rFonts w:asciiTheme="minorHAnsi" w:hAnsiTheme="minorHAnsi" w:cstheme="minorHAnsi"/>
+          <w:lang w:val="en-GB"/>
         </w:rPr>
         <w:br w:type="page"/>
       </w:r>
@@ -4417,18 +4791,316 @@
     </w:lvl>
   </w:abstractNum>
   <w:abstractNum w:abstractNumId="6" w15:restartNumberingAfterBreak="0">
+    <w:nsid w:val="16B262F3"/>
+    <w:multiLevelType w:val="multilevel"/>
+    <w:tmpl w:val="A76C7C48"/>
+    <w:lvl w:ilvl="0">
+      <w:start w:val="1"/>
+      <w:numFmt w:val="bullet"/>
+      <w:lvlText w:val=""/>
+      <w:lvlJc w:val="left"/>
+      <w:pPr>
+        <w:tabs>
+          <w:tab w:val="num" w:pos="720"/>
+        </w:tabs>
+        <w:ind w:left="720" w:hanging="360"/>
+      </w:pPr>
+      <w:rPr>
+        <w:rFonts w:ascii="Symbol" w:hAnsi="Symbol" w:hint="default"/>
+        <w:sz w:val="20"/>
+      </w:rPr>
+    </w:lvl>
+    <w:lvl w:ilvl="1" w:tentative="1">
+      <w:start w:val="1"/>
+      <w:numFmt w:val="bullet"/>
+      <w:lvlText w:val="o"/>
+      <w:lvlJc w:val="left"/>
+      <w:pPr>
+        <w:tabs>
+          <w:tab w:val="num" w:pos="1440"/>
+        </w:tabs>
+        <w:ind w:left="1440" w:hanging="360"/>
+      </w:pPr>
+      <w:rPr>
+        <w:rFonts w:ascii="Courier New" w:hAnsi="Courier New" w:hint="default"/>
+        <w:sz w:val="20"/>
+      </w:rPr>
+    </w:lvl>
+    <w:lvl w:ilvl="2" w:tentative="1">
+      <w:start w:val="1"/>
+      <w:numFmt w:val="bullet"/>
+      <w:lvlText w:val=""/>
+      <w:lvlJc w:val="left"/>
+      <w:pPr>
+        <w:tabs>
+          <w:tab w:val="num" w:pos="2160"/>
+        </w:tabs>
+        <w:ind w:left="2160" w:hanging="360"/>
+      </w:pPr>
+      <w:rPr>
+        <w:rFonts w:ascii="Wingdings" w:hAnsi="Wingdings" w:hint="default"/>
+        <w:sz w:val="20"/>
+      </w:rPr>
+    </w:lvl>
+    <w:lvl w:ilvl="3" w:tentative="1">
+      <w:start w:val="1"/>
+      <w:numFmt w:val="bullet"/>
+      <w:lvlText w:val=""/>
+      <w:lvlJc w:val="left"/>
+      <w:pPr>
+        <w:tabs>
+          <w:tab w:val="num" w:pos="2880"/>
+        </w:tabs>
+        <w:ind w:left="2880" w:hanging="360"/>
+      </w:pPr>
+      <w:rPr>
+        <w:rFonts w:ascii="Wingdings" w:hAnsi="Wingdings" w:hint="default"/>
+        <w:sz w:val="20"/>
+      </w:rPr>
+    </w:lvl>
+    <w:lvl w:ilvl="4" w:tentative="1">
+      <w:start w:val="1"/>
+      <w:numFmt w:val="bullet"/>
+      <w:lvlText w:val=""/>
+      <w:lvlJc w:val="left"/>
+      <w:pPr>
+        <w:tabs>
+          <w:tab w:val="num" w:pos="3600"/>
+        </w:tabs>
+        <w:ind w:left="3600" w:hanging="360"/>
+      </w:pPr>
+      <w:rPr>
+        <w:rFonts w:ascii="Wingdings" w:hAnsi="Wingdings" w:hint="default"/>
+        <w:sz w:val="20"/>
+      </w:rPr>
+    </w:lvl>
+    <w:lvl w:ilvl="5" w:tentative="1">
+      <w:start w:val="1"/>
+      <w:numFmt w:val="bullet"/>
+      <w:lvlText w:val=""/>
+      <w:lvlJc w:val="left"/>
+      <w:pPr>
+        <w:tabs>
+          <w:tab w:val="num" w:pos="4320"/>
+        </w:tabs>
+        <w:ind w:left="4320" w:hanging="360"/>
+      </w:pPr>
+      <w:rPr>
+        <w:rFonts w:ascii="Wingdings" w:hAnsi="Wingdings" w:hint="default"/>
+        <w:sz w:val="20"/>
+      </w:rPr>
+    </w:lvl>
+    <w:lvl w:ilvl="6" w:tentative="1">
+      <w:start w:val="1"/>
+      <w:numFmt w:val="bullet"/>
+      <w:lvlText w:val=""/>
+      <w:lvlJc w:val="left"/>
+      <w:pPr>
+        <w:tabs>
+          <w:tab w:val="num" w:pos="5040"/>
+        </w:tabs>
+        <w:ind w:left="5040" w:hanging="360"/>
+      </w:pPr>
+      <w:rPr>
+        <w:rFonts w:ascii="Wingdings" w:hAnsi="Wingdings" w:hint="default"/>
+        <w:sz w:val="20"/>
+      </w:rPr>
+    </w:lvl>
+    <w:lvl w:ilvl="7" w:tentative="1">
+      <w:start w:val="1"/>
+      <w:numFmt w:val="bullet"/>
+      <w:lvlText w:val=""/>
+      <w:lvlJc w:val="left"/>
+      <w:pPr>
+        <w:tabs>
+          <w:tab w:val="num" w:pos="5760"/>
+        </w:tabs>
+        <w:ind w:left="5760" w:hanging="360"/>
+      </w:pPr>
+      <w:rPr>
+        <w:rFonts w:ascii="Wingdings" w:hAnsi="Wingdings" w:hint="default"/>
+        <w:sz w:val="20"/>
+      </w:rPr>
+    </w:lvl>
+    <w:lvl w:ilvl="8" w:tentative="1">
+      <w:start w:val="1"/>
+      <w:numFmt w:val="bullet"/>
+      <w:lvlText w:val=""/>
+      <w:lvlJc w:val="left"/>
+      <w:pPr>
+        <w:tabs>
+          <w:tab w:val="num" w:pos="6480"/>
+        </w:tabs>
+        <w:ind w:left="6480" w:hanging="360"/>
+      </w:pPr>
+      <w:rPr>
+        <w:rFonts w:ascii="Wingdings" w:hAnsi="Wingdings" w:hint="default"/>
+        <w:sz w:val="20"/>
+      </w:rPr>
+    </w:lvl>
+  </w:abstractNum>
+  <w:abstractNum w:abstractNumId="7" w15:restartNumberingAfterBreak="0">
     <w:nsid w:val="25FE31BF"/>
     <w:multiLevelType w:val="multilevel"/>
     <w:tmpl w:val="1FAEA500"/>
     <w:numStyleLink w:val="Aufzhlung"/>
   </w:abstractNum>
-  <w:abstractNum w:abstractNumId="7" w15:restartNumberingAfterBreak="0">
+  <w:abstractNum w:abstractNumId="8" w15:restartNumberingAfterBreak="0">
+    <w:nsid w:val="2A734292"/>
+    <w:multiLevelType w:val="multilevel"/>
+    <w:tmpl w:val="36500792"/>
+    <w:lvl w:ilvl="0">
+      <w:start w:val="1"/>
+      <w:numFmt w:val="bullet"/>
+      <w:lvlText w:val=""/>
+      <w:lvlJc w:val="left"/>
+      <w:pPr>
+        <w:tabs>
+          <w:tab w:val="num" w:pos="720"/>
+        </w:tabs>
+        <w:ind w:left="720" w:hanging="360"/>
+      </w:pPr>
+      <w:rPr>
+        <w:rFonts w:ascii="Symbol" w:hAnsi="Symbol" w:hint="default"/>
+        <w:sz w:val="20"/>
+      </w:rPr>
+    </w:lvl>
+    <w:lvl w:ilvl="1" w:tentative="1">
+      <w:start w:val="1"/>
+      <w:numFmt w:val="bullet"/>
+      <w:lvlText w:val="o"/>
+      <w:lvlJc w:val="left"/>
+      <w:pPr>
+        <w:tabs>
+          <w:tab w:val="num" w:pos="1440"/>
+        </w:tabs>
+        <w:ind w:left="1440" w:hanging="360"/>
+      </w:pPr>
+      <w:rPr>
+        <w:rFonts w:ascii="Courier New" w:hAnsi="Courier New" w:hint="default"/>
+        <w:sz w:val="20"/>
+      </w:rPr>
+    </w:lvl>
+    <w:lvl w:ilvl="2" w:tentative="1">
+      <w:start w:val="1"/>
+      <w:numFmt w:val="bullet"/>
+      <w:lvlText w:val=""/>
+      <w:lvlJc w:val="left"/>
+      <w:pPr>
+        <w:tabs>
+          <w:tab w:val="num" w:pos="2160"/>
+        </w:tabs>
+        <w:ind w:left="2160" w:hanging="360"/>
+      </w:pPr>
+      <w:rPr>
+        <w:rFonts w:ascii="Wingdings" w:hAnsi="Wingdings" w:hint="default"/>
+        <w:sz w:val="20"/>
+      </w:rPr>
+    </w:lvl>
+    <w:lvl w:ilvl="3" w:tentative="1">
+      <w:start w:val="1"/>
+      <w:numFmt w:val="bullet"/>
+      <w:lvlText w:val=""/>
+      <w:lvlJc w:val="left"/>
+      <w:pPr>
+        <w:tabs>
+          <w:tab w:val="num" w:pos="2880"/>
+        </w:tabs>
+        <w:ind w:left="2880" w:hanging="360"/>
+      </w:pPr>
+      <w:rPr>
+        <w:rFonts w:ascii="Wingdings" w:hAnsi="Wingdings" w:hint="default"/>
+        <w:sz w:val="20"/>
+      </w:rPr>
+    </w:lvl>
+    <w:lvl w:ilvl="4" w:tentative="1">
+      <w:start w:val="1"/>
+      <w:numFmt w:val="bullet"/>
+      <w:lvlText w:val=""/>
+      <w:lvlJc w:val="left"/>
+      <w:pPr>
+        <w:tabs>
+          <w:tab w:val="num" w:pos="3600"/>
+        </w:tabs>
+        <w:ind w:left="3600" w:hanging="360"/>
+      </w:pPr>
+      <w:rPr>
+        <w:rFonts w:ascii="Wingdings" w:hAnsi="Wingdings" w:hint="default"/>
+        <w:sz w:val="20"/>
+      </w:rPr>
+    </w:lvl>
+    <w:lvl w:ilvl="5" w:tentative="1">
+      <w:start w:val="1"/>
+      <w:numFmt w:val="bullet"/>
+      <w:lvlText w:val=""/>
+      <w:lvlJc w:val="left"/>
+      <w:pPr>
+        <w:tabs>
+          <w:tab w:val="num" w:pos="4320"/>
+        </w:tabs>
+        <w:ind w:left="4320" w:hanging="360"/>
+      </w:pPr>
+      <w:rPr>
+        <w:rFonts w:ascii="Wingdings" w:hAnsi="Wingdings" w:hint="default"/>
+        <w:sz w:val="20"/>
+      </w:rPr>
+    </w:lvl>
+    <w:lvl w:ilvl="6" w:tentative="1">
+      <w:start w:val="1"/>
+      <w:numFmt w:val="bullet"/>
+      <w:lvlText w:val=""/>
+      <w:lvlJc w:val="left"/>
+      <w:pPr>
+        <w:tabs>
+          <w:tab w:val="num" w:pos="5040"/>
+        </w:tabs>
+        <w:ind w:left="5040" w:hanging="360"/>
+      </w:pPr>
+      <w:rPr>
+        <w:rFonts w:ascii="Wingdings" w:hAnsi="Wingdings" w:hint="default"/>
+        <w:sz w:val="20"/>
+      </w:rPr>
+    </w:lvl>
+    <w:lvl w:ilvl="7" w:tentative="1">
+      <w:start w:val="1"/>
+      <w:numFmt w:val="bullet"/>
+      <w:lvlText w:val=""/>
+      <w:lvlJc w:val="left"/>
+      <w:pPr>
+        <w:tabs>
+          <w:tab w:val="num" w:pos="5760"/>
+        </w:tabs>
+        <w:ind w:left="5760" w:hanging="360"/>
+      </w:pPr>
+      <w:rPr>
+        <w:rFonts w:ascii="Wingdings" w:hAnsi="Wingdings" w:hint="default"/>
+        <w:sz w:val="20"/>
+      </w:rPr>
+    </w:lvl>
+    <w:lvl w:ilvl="8" w:tentative="1">
+      <w:start w:val="1"/>
+      <w:numFmt w:val="bullet"/>
+      <w:lvlText w:val=""/>
+      <w:lvlJc w:val="left"/>
+      <w:pPr>
+        <w:tabs>
+          <w:tab w:val="num" w:pos="6480"/>
+        </w:tabs>
+        <w:ind w:left="6480" w:hanging="360"/>
+      </w:pPr>
+      <w:rPr>
+        <w:rFonts w:ascii="Wingdings" w:hAnsi="Wingdings" w:hint="default"/>
+        <w:sz w:val="20"/>
+      </w:rPr>
+    </w:lvl>
+  </w:abstractNum>
+  <w:abstractNum w:abstractNumId="9" w15:restartNumberingAfterBreak="0">
     <w:nsid w:val="351E7814"/>
     <w:multiLevelType w:val="multilevel"/>
     <w:tmpl w:val="1FAEA500"/>
     <w:numStyleLink w:val="Aufzhlung"/>
   </w:abstractNum>
-  <w:abstractNum w:abstractNumId="8" w15:restartNumberingAfterBreak="0">
+  <w:abstractNum w:abstractNumId="10" w15:restartNumberingAfterBreak="0">
     <w:nsid w:val="392E67A8"/>
     <w:multiLevelType w:val="multilevel"/>
     <w:tmpl w:val="696AA2DE"/>
@@ -4514,7 +5186,7 @@
       </w:pPr>
     </w:lvl>
   </w:abstractNum>
-  <w:abstractNum w:abstractNumId="9" w15:restartNumberingAfterBreak="0">
+  <w:abstractNum w:abstractNumId="11" w15:restartNumberingAfterBreak="0">
     <w:nsid w:val="42656BA9"/>
     <w:multiLevelType w:val="multilevel"/>
     <w:tmpl w:val="20F49B40"/>
@@ -4600,7 +5272,156 @@
       </w:pPr>
     </w:lvl>
   </w:abstractNum>
-  <w:abstractNum w:abstractNumId="10" w15:restartNumberingAfterBreak="0">
+  <w:abstractNum w:abstractNumId="12" w15:restartNumberingAfterBreak="0">
+    <w:nsid w:val="50686340"/>
+    <w:multiLevelType w:val="multilevel"/>
+    <w:tmpl w:val="CF58D75A"/>
+    <w:lvl w:ilvl="0">
+      <w:start w:val="1"/>
+      <w:numFmt w:val="bullet"/>
+      <w:lvlText w:val=""/>
+      <w:lvlJc w:val="left"/>
+      <w:pPr>
+        <w:tabs>
+          <w:tab w:val="num" w:pos="720"/>
+        </w:tabs>
+        <w:ind w:left="720" w:hanging="360"/>
+      </w:pPr>
+      <w:rPr>
+        <w:rFonts w:ascii="Symbol" w:hAnsi="Symbol" w:hint="default"/>
+        <w:sz w:val="20"/>
+      </w:rPr>
+    </w:lvl>
+    <w:lvl w:ilvl="1">
+      <w:start w:val="1"/>
+      <w:numFmt w:val="bullet"/>
+      <w:lvlText w:val="o"/>
+      <w:lvlJc w:val="left"/>
+      <w:pPr>
+        <w:tabs>
+          <w:tab w:val="num" w:pos="1440"/>
+        </w:tabs>
+        <w:ind w:left="1440" w:hanging="360"/>
+      </w:pPr>
+      <w:rPr>
+        <w:rFonts w:ascii="Courier New" w:hAnsi="Courier New" w:hint="default"/>
+        <w:sz w:val="20"/>
+      </w:rPr>
+    </w:lvl>
+    <w:lvl w:ilvl="2" w:tentative="1">
+      <w:start w:val="1"/>
+      <w:numFmt w:val="bullet"/>
+      <w:lvlText w:val=""/>
+      <w:lvlJc w:val="left"/>
+      <w:pPr>
+        <w:tabs>
+          <w:tab w:val="num" w:pos="2160"/>
+        </w:tabs>
+        <w:ind w:left="2160" w:hanging="360"/>
+      </w:pPr>
+      <w:rPr>
+        <w:rFonts w:ascii="Wingdings" w:hAnsi="Wingdings" w:hint="default"/>
+        <w:sz w:val="20"/>
+      </w:rPr>
+    </w:lvl>
+    <w:lvl w:ilvl="3" w:tentative="1">
+      <w:start w:val="1"/>
+      <w:numFmt w:val="bullet"/>
+      <w:lvlText w:val=""/>
+      <w:lvlJc w:val="left"/>
+      <w:pPr>
+        <w:tabs>
+          <w:tab w:val="num" w:pos="2880"/>
+        </w:tabs>
+        <w:ind w:left="2880" w:hanging="360"/>
+      </w:pPr>
+      <w:rPr>
+        <w:rFonts w:ascii="Wingdings" w:hAnsi="Wingdings" w:hint="default"/>
+        <w:sz w:val="20"/>
+      </w:rPr>
+    </w:lvl>
+    <w:lvl w:ilvl="4" w:tentative="1">
+      <w:start w:val="1"/>
+      <w:numFmt w:val="bullet"/>
+      <w:lvlText w:val=""/>
+      <w:lvlJc w:val="left"/>
+      <w:pPr>
+        <w:tabs>
+          <w:tab w:val="num" w:pos="3600"/>
+        </w:tabs>
+        <w:ind w:left="3600" w:hanging="360"/>
+      </w:pPr>
+      <w:rPr>
+        <w:rFonts w:ascii="Wingdings" w:hAnsi="Wingdings" w:hint="default"/>
+        <w:sz w:val="20"/>
+      </w:rPr>
+    </w:lvl>
+    <w:lvl w:ilvl="5" w:tentative="1">
+      <w:start w:val="1"/>
+      <w:numFmt w:val="bullet"/>
+      <w:lvlText w:val=""/>
+      <w:lvlJc w:val="left"/>
+      <w:pPr>
+        <w:tabs>
+          <w:tab w:val="num" w:pos="4320"/>
+        </w:tabs>
+        <w:ind w:left="4320" w:hanging="360"/>
+      </w:pPr>
+      <w:rPr>
+        <w:rFonts w:ascii="Wingdings" w:hAnsi="Wingdings" w:hint="default"/>
+        <w:sz w:val="20"/>
+      </w:rPr>
+    </w:lvl>
+    <w:lvl w:ilvl="6" w:tentative="1">
+      <w:start w:val="1"/>
+      <w:numFmt w:val="bullet"/>
+      <w:lvlText w:val=""/>
+      <w:lvlJc w:val="left"/>
+      <w:pPr>
+        <w:tabs>
+          <w:tab w:val="num" w:pos="5040"/>
+        </w:tabs>
+        <w:ind w:left="5040" w:hanging="360"/>
+      </w:pPr>
+      <w:rPr>
+        <w:rFonts w:ascii="Wingdings" w:hAnsi="Wingdings" w:hint="default"/>
+        <w:sz w:val="20"/>
+      </w:rPr>
+    </w:lvl>
+    <w:lvl w:ilvl="7" w:tentative="1">
+      <w:start w:val="1"/>
+      <w:numFmt w:val="bullet"/>
+      <w:lvlText w:val=""/>
+      <w:lvlJc w:val="left"/>
+      <w:pPr>
+        <w:tabs>
+          <w:tab w:val="num" w:pos="5760"/>
+        </w:tabs>
+        <w:ind w:left="5760" w:hanging="360"/>
+      </w:pPr>
+      <w:rPr>
+        <w:rFonts w:ascii="Wingdings" w:hAnsi="Wingdings" w:hint="default"/>
+        <w:sz w:val="20"/>
+      </w:rPr>
+    </w:lvl>
+    <w:lvl w:ilvl="8" w:tentative="1">
+      <w:start w:val="1"/>
+      <w:numFmt w:val="bullet"/>
+      <w:lvlText w:val=""/>
+      <w:lvlJc w:val="left"/>
+      <w:pPr>
+        <w:tabs>
+          <w:tab w:val="num" w:pos="6480"/>
+        </w:tabs>
+        <w:ind w:left="6480" w:hanging="360"/>
+      </w:pPr>
+      <w:rPr>
+        <w:rFonts w:ascii="Wingdings" w:hAnsi="Wingdings" w:hint="default"/>
+        <w:sz w:val="20"/>
+      </w:rPr>
+    </w:lvl>
+  </w:abstractNum>
+  <w:abstractNum w:abstractNumId="13" w15:restartNumberingAfterBreak="0">
     <w:nsid w:val="525D11AF"/>
     <w:multiLevelType w:val="hybridMultilevel"/>
     <w:tmpl w:val="290405D0"/>
@@ -4713,7 +5534,7 @@
       </w:rPr>
     </w:lvl>
   </w:abstractNum>
-  <w:abstractNum w:abstractNumId="11" w15:restartNumberingAfterBreak="0">
+  <w:abstractNum w:abstractNumId="14" w15:restartNumberingAfterBreak="0">
     <w:nsid w:val="56400DFE"/>
     <w:multiLevelType w:val="multilevel"/>
     <w:tmpl w:val="3FC861A0"/>
@@ -4841,7 +5662,7 @@
       </w:rPr>
     </w:lvl>
   </w:abstractNum>
-  <w:abstractNum w:abstractNumId="12" w15:restartNumberingAfterBreak="0">
+  <w:abstractNum w:abstractNumId="15" w15:restartNumberingAfterBreak="0">
     <w:nsid w:val="57D24D7B"/>
     <w:multiLevelType w:val="hybridMultilevel"/>
     <w:tmpl w:val="66380C4E"/>
@@ -4954,7 +5775,7 @@
       </w:rPr>
     </w:lvl>
   </w:abstractNum>
-  <w:abstractNum w:abstractNumId="13" w15:restartNumberingAfterBreak="0">
+  <w:abstractNum w:abstractNumId="16" w15:restartNumberingAfterBreak="0">
     <w:nsid w:val="583F3792"/>
     <w:multiLevelType w:val="multilevel"/>
     <w:tmpl w:val="B8784D42"/>
@@ -5082,7 +5903,7 @@
       </w:rPr>
     </w:lvl>
   </w:abstractNum>
-  <w:abstractNum w:abstractNumId="14" w15:restartNumberingAfterBreak="0">
+  <w:abstractNum w:abstractNumId="17" w15:restartNumberingAfterBreak="0">
     <w:nsid w:val="692324A0"/>
     <w:multiLevelType w:val="hybridMultilevel"/>
     <w:tmpl w:val="891ED2EC"/>
@@ -5195,7 +6016,7 @@
       </w:rPr>
     </w:lvl>
   </w:abstractNum>
-  <w:abstractNum w:abstractNumId="15" w15:restartNumberingAfterBreak="0">
+  <w:abstractNum w:abstractNumId="18" w15:restartNumberingAfterBreak="0">
     <w:nsid w:val="6C13601A"/>
     <w:multiLevelType w:val="multilevel"/>
     <w:tmpl w:val="EA5E96C0"/>
@@ -5320,7 +6141,7 @@
       </w:rPr>
     </w:lvl>
   </w:abstractNum>
-  <w:abstractNum w:abstractNumId="16" w15:restartNumberingAfterBreak="0">
+  <w:abstractNum w:abstractNumId="19" w15:restartNumberingAfterBreak="0">
     <w:nsid w:val="6ECF55AE"/>
     <w:multiLevelType w:val="multilevel"/>
     <w:tmpl w:val="1FAEA500"/>
@@ -5449,7 +6270,7 @@
       </w:rPr>
     </w:lvl>
   </w:abstractNum>
-  <w:abstractNum w:abstractNumId="17" w15:restartNumberingAfterBreak="0">
+  <w:abstractNum w:abstractNumId="20" w15:restartNumberingAfterBreak="0">
     <w:nsid w:val="71941B00"/>
     <w:multiLevelType w:val="hybridMultilevel"/>
     <w:tmpl w:val="6162674A"/>
@@ -5535,7 +6356,7 @@
       </w:pPr>
     </w:lvl>
   </w:abstractNum>
-  <w:abstractNum w:abstractNumId="18" w15:restartNumberingAfterBreak="0">
+  <w:abstractNum w:abstractNumId="21" w15:restartNumberingAfterBreak="0">
     <w:nsid w:val="72A608F1"/>
     <w:multiLevelType w:val="hybridMultilevel"/>
     <w:tmpl w:val="87068544"/>
@@ -5648,7 +6469,7 @@
       </w:rPr>
     </w:lvl>
   </w:abstractNum>
-  <w:abstractNum w:abstractNumId="19" w15:restartNumberingAfterBreak="0">
+  <w:abstractNum w:abstractNumId="22" w15:restartNumberingAfterBreak="0">
     <w:nsid w:val="787A2B5D"/>
     <w:multiLevelType w:val="multilevel"/>
     <w:tmpl w:val="B8784D42"/>
@@ -5776,7 +6597,7 @@
       </w:rPr>
     </w:lvl>
   </w:abstractNum>
-  <w:abstractNum w:abstractNumId="20" w15:restartNumberingAfterBreak="0">
+  <w:abstractNum w:abstractNumId="23" w15:restartNumberingAfterBreak="0">
     <w:nsid w:val="7BA535EF"/>
     <w:multiLevelType w:val="multilevel"/>
     <w:tmpl w:val="0C070025"/>
@@ -5875,43 +6696,43 @@
     <w:abstractNumId w:val="5"/>
   </w:num>
   <w:num w:numId="2" w16cid:durableId="1210844178">
+    <w:abstractNumId w:val="21"/>
+  </w:num>
+  <w:num w:numId="3" w16cid:durableId="1009451812">
+    <w:abstractNumId w:val="15"/>
+  </w:num>
+  <w:num w:numId="4" w16cid:durableId="171604977">
     <w:abstractNumId w:val="18"/>
   </w:num>
-  <w:num w:numId="3" w16cid:durableId="1009451812">
-    <w:abstractNumId w:val="12"/>
-  </w:num>
-  <w:num w:numId="4" w16cid:durableId="171604977">
-    <w:abstractNumId w:val="15"/>
-  </w:num>
   <w:num w:numId="5" w16cid:durableId="760568913">
-    <w:abstractNumId w:val="11"/>
+    <w:abstractNumId w:val="14"/>
   </w:num>
   <w:num w:numId="6" w16cid:durableId="1151287298">
-    <w:abstractNumId w:val="13"/>
+    <w:abstractNumId w:val="16"/>
   </w:num>
   <w:num w:numId="7" w16cid:durableId="1643928037">
-    <w:abstractNumId w:val="19"/>
+    <w:abstractNumId w:val="22"/>
   </w:num>
   <w:num w:numId="8" w16cid:durableId="1963346193">
     <w:abstractNumId w:val="3"/>
   </w:num>
   <w:num w:numId="9" w16cid:durableId="425885222">
-    <w:abstractNumId w:val="6"/>
+    <w:abstractNumId w:val="7"/>
   </w:num>
   <w:num w:numId="10" w16cid:durableId="1767846491">
-    <w:abstractNumId w:val="16"/>
+    <w:abstractNumId w:val="19"/>
   </w:num>
   <w:num w:numId="11" w16cid:durableId="881865202">
     <w:abstractNumId w:val="2"/>
   </w:num>
   <w:num w:numId="12" w16cid:durableId="1196621923">
-    <w:abstractNumId w:val="7"/>
+    <w:abstractNumId w:val="9"/>
   </w:num>
   <w:num w:numId="13" w16cid:durableId="1660190631">
-    <w:abstractNumId w:val="8"/>
+    <w:abstractNumId w:val="10"/>
   </w:num>
   <w:num w:numId="14" w16cid:durableId="391346200">
-    <w:abstractNumId w:val="20"/>
+    <w:abstractNumId w:val="23"/>
   </w:num>
   <w:num w:numId="15" w16cid:durableId="1249147287">
     <w:abstractNumId w:val="1"/>
@@ -5920,22 +6741,31 @@
     <w:abstractNumId w:val="4"/>
   </w:num>
   <w:num w:numId="17" w16cid:durableId="2146845818">
-    <w:abstractNumId w:val="9"/>
+    <w:abstractNumId w:val="11"/>
   </w:num>
   <w:num w:numId="18" w16cid:durableId="1450783992">
     <w:abstractNumId w:val="0"/>
   </w:num>
   <w:num w:numId="19" w16cid:durableId="734471245">
-    <w:abstractNumId w:val="10"/>
+    <w:abstractNumId w:val="13"/>
   </w:num>
   <w:num w:numId="20" w16cid:durableId="1950120874">
+    <w:abstractNumId w:val="20"/>
+  </w:num>
+  <w:num w:numId="21" w16cid:durableId="618417102">
+    <w:abstractNumId w:val="23"/>
+  </w:num>
+  <w:num w:numId="22" w16cid:durableId="343168568">
     <w:abstractNumId w:val="17"/>
   </w:num>
-  <w:num w:numId="21" w16cid:durableId="618417102">
-    <w:abstractNumId w:val="20"/>
+  <w:num w:numId="23" w16cid:durableId="561254279">
+    <w:abstractNumId w:val="6"/>
   </w:num>
-  <w:num w:numId="22" w16cid:durableId="343168568">
-    <w:abstractNumId w:val="14"/>
+  <w:num w:numId="24" w16cid:durableId="621110803">
+    <w:abstractNumId w:val="12"/>
+  </w:num>
+  <w:num w:numId="25" w16cid:durableId="1871331100">
+    <w:abstractNumId w:val="8"/>
   </w:num>
 </w:numbering>
 </file>
@@ -6565,7 +7395,6 @@
   <w:style w:type="character" w:default="1" w:styleId="Absatz-Standardschriftart">
     <w:name w:val="Default Paragraph Font"/>
     <w:uiPriority w:val="1"/>
-    <w:semiHidden/>
     <w:unhideWhenUsed/>
   </w:style>
   <w:style w:type="table" w:default="1" w:styleId="NormaleTabelle">
@@ -7752,15 +8581,6 @@
 </file>
 
 <file path=customXml/item1.xml><?xml version="1.0" encoding="utf-8"?>
-<?mso-contentType ?>
-<FormTemplates xmlns="http://schemas.microsoft.com/sharepoint/v3/contenttype/forms">
-  <Display>DocumentLibraryForm</Display>
-  <Edit>DocumentLibraryForm</Edit>
-  <New>DocumentLibraryForm</New>
-</FormTemplates>
-</file>
-
-<file path=customXml/item2.xml><?xml version="1.0" encoding="utf-8"?>
 <p:properties xmlns:p="http://schemas.microsoft.com/office/2006/metadata/properties" xmlns:xsi="http://www.w3.org/2001/XMLSchema-instance" xmlns:pc="http://schemas.microsoft.com/office/infopath/2007/PartnerControls">
   <documentManagement>
     <lcf76f155ced4ddcb4097134ff3c332f xmlns="1bd98149-fa75-4233-951c-f2f3fedfd2c2">
@@ -7771,7 +8591,90 @@
 </p:properties>
 </file>
 
+<file path=customXml/item2.xml><?xml version="1.0" encoding="utf-8"?>
+<?mso-contentType ?>
+<FormTemplates xmlns="http://schemas.microsoft.com/sharepoint/v3/contenttype/forms">
+  <Display>DocumentLibraryForm</Display>
+  <Edit>DocumentLibraryForm</Edit>
+  <New>DocumentLibraryForm</New>
+</FormTemplates>
+</file>
+
 <file path=customXml/item3.xml><?xml version="1.0" encoding="utf-8"?>
+<b:Sources xmlns:b="http://schemas.openxmlformats.org/officeDocument/2006/bibliography" xmlns="http://schemas.openxmlformats.org/officeDocument/2006/bibliography" SelectedStyle="\IEEE2006OfficeOnline.xsl" StyleName="IEEE 2006">
+  <b:Source>
+    <b:Tag>GEi15</b:Tag>
+    <b:SourceType>ArticleInAPeriodical</b:SourceType>
+    <b:Guid>{181CA359-F239-4A87-A1F1-460C6F4A0BD2}</b:Guid>
+    <b:Author>
+      <b:Author>
+        <b:NameList>
+          <b:Person>
+            <b:Last>Eibl</b:Last>
+            <b:First>Günther</b:First>
+          </b:Person>
+          <b:Person>
+            <b:Last>Engel</b:Last>
+            <b:First>Dominik</b:First>
+          </b:Person>
+        </b:NameList>
+      </b:Author>
+    </b:Author>
+    <b:Title>Influence of Data Granularity on Smart Meter Privacy</b:Title>
+    <b:PeriodicalTitle>IEEE Trans. Smart Grid, vol. 6, no. 2</b:PeriodicalTitle>
+    <b:Year>2015</b:Year>
+    <b:Pages>930–939</b:Pages>
+    <b:RefOrder>1</b:RefOrder>
+  </b:Source>
+  <b:Source>
+    <b:Tag>Ale15</b:Tag>
+    <b:SourceType>InternetSite</b:SourceType>
+    <b:Guid>{98C8FE52-DE21-40E1-A6F1-90F938EEDF1C}</b:Guid>
+    <b:Author>
+      <b:Author>
+        <b:NameList>
+          <b:Person>
+            <b:Last>Trisko</b:Last>
+            <b:First>Alexander</b:First>
+          </b:Person>
+        </b:NameList>
+      </b:Author>
+    </b:Author>
+    <b:Title>Rectenna: Innovatives System verwandelt Licht direkt in Strom</b:Title>
+    <b:Year>2015</b:Year>
+    <b:Month>Oktober</b:Month>
+    <b:Day>19</b:Day>
+    <b:YearAccessed>2015</b:YearAccessed>
+    <b:MonthAccessed>Oktober</b:MonthAccessed>
+    <b:DayAccessed>28</b:DayAccessed>
+    <b:URL>http://www.trendsderzukunft.de/rectenna-innovatives-system-verwandelt-licht-direkt-in-strom/2015/10/19/</b:URL>
+    <b:RefOrder>2</b:RefOrder>
+  </b:Source>
+  <b:Source>
+    <b:Tag>Hel08</b:Tag>
+    <b:SourceType>Book</b:SourceType>
+    <b:Guid>{3299869E-A058-432A-9761-21F551D0610B}</b:Guid>
+    <b:Title>Von der Idee zum Text. Eine Anleitung zum wissenschaftlichen Schreiben</b:Title>
+    <b:Year>2008</b:Year>
+    <b:Publisher>Schöningh</b:Publisher>
+    <b:City> Paderborn</b:City>
+    <b:Author>
+      <b:Author>
+        <b:NameList>
+          <b:Person>
+            <b:Last>Esselborn-Krumbiegel</b:Last>
+            <b:First>Helga</b:First>
+          </b:Person>
+        </b:NameList>
+      </b:Author>
+    </b:Author>
+    <b:Edition>3. überarb. Aufl</b:Edition>
+    <b:RefOrder>3</b:RefOrder>
+  </b:Source>
+</b:Sources>
+</file>
+
+<file path=customXml/item4.xml><?xml version="1.0" encoding="utf-8"?>
 <ct:contentTypeSchema xmlns:ct="http://schemas.microsoft.com/office/2006/metadata/contentType" xmlns:ma="http://schemas.microsoft.com/office/2006/metadata/properties/metaAttributes" ct:_="" ma:_="" ma:contentTypeName="Dokument" ma:contentTypeID="0x010100E6409E0E50F7664EBCAA51856150D544" ma:contentTypeVersion="11" ma:contentTypeDescription="Ein neues Dokument erstellen." ma:contentTypeScope="" ma:versionID="1c182610d70f874ea490c22f66d42c75">
   <xsd:schema xmlns:xsd="http://www.w3.org/2001/XMLSchema" xmlns:xs="http://www.w3.org/2001/XMLSchema" xmlns:p="http://schemas.microsoft.com/office/2006/metadata/properties" xmlns:ns2="1bd98149-fa75-4233-951c-f2f3fedfd2c2" xmlns:ns3="b9e2605c-4a5c-404d-9e25-72c4582cfe63" targetNamespace="http://schemas.microsoft.com/office/2006/metadata/properties" ma:root="true" ma:fieldsID="c836e3cdf6e930ed391f81ee539c0afe" ns2:_="" ns3:_="">
     <xsd:import namespace="1bd98149-fa75-4233-951c-f2f3fedfd2c2"/>
@@ -7966,89 +8869,7 @@
 </ct:contentTypeSchema>
 </file>
 
-<file path=customXml/item4.xml><?xml version="1.0" encoding="utf-8"?>
-<b:Sources xmlns:b="http://schemas.openxmlformats.org/officeDocument/2006/bibliography" xmlns="http://schemas.openxmlformats.org/officeDocument/2006/bibliography" SelectedStyle="\IEEE2006OfficeOnline.xsl" StyleName="IEEE 2006">
-  <b:Source>
-    <b:Tag>GEi15</b:Tag>
-    <b:SourceType>ArticleInAPeriodical</b:SourceType>
-    <b:Guid>{181CA359-F239-4A87-A1F1-460C6F4A0BD2}</b:Guid>
-    <b:Author>
-      <b:Author>
-        <b:NameList>
-          <b:Person>
-            <b:Last>Eibl</b:Last>
-            <b:First>Günther</b:First>
-          </b:Person>
-          <b:Person>
-            <b:Last>Engel</b:Last>
-            <b:First>Dominik</b:First>
-          </b:Person>
-        </b:NameList>
-      </b:Author>
-    </b:Author>
-    <b:Title>Influence of Data Granularity on Smart Meter Privacy</b:Title>
-    <b:PeriodicalTitle>IEEE Trans. Smart Grid, vol. 6, no. 2</b:PeriodicalTitle>
-    <b:Year>2015</b:Year>
-    <b:Pages>930–939</b:Pages>
-    <b:RefOrder>1</b:RefOrder>
-  </b:Source>
-  <b:Source>
-    <b:Tag>Ale15</b:Tag>
-    <b:SourceType>InternetSite</b:SourceType>
-    <b:Guid>{98C8FE52-DE21-40E1-A6F1-90F938EEDF1C}</b:Guid>
-    <b:Author>
-      <b:Author>
-        <b:NameList>
-          <b:Person>
-            <b:Last>Trisko</b:Last>
-            <b:First>Alexander</b:First>
-          </b:Person>
-        </b:NameList>
-      </b:Author>
-    </b:Author>
-    <b:Title>Rectenna: Innovatives System verwandelt Licht direkt in Strom</b:Title>
-    <b:Year>2015</b:Year>
-    <b:Month>Oktober</b:Month>
-    <b:Day>19</b:Day>
-    <b:YearAccessed>2015</b:YearAccessed>
-    <b:MonthAccessed>Oktober</b:MonthAccessed>
-    <b:DayAccessed>28</b:DayAccessed>
-    <b:URL>http://www.trendsderzukunft.de/rectenna-innovatives-system-verwandelt-licht-direkt-in-strom/2015/10/19/</b:URL>
-    <b:RefOrder>2</b:RefOrder>
-  </b:Source>
-  <b:Source>
-    <b:Tag>Hel08</b:Tag>
-    <b:SourceType>Book</b:SourceType>
-    <b:Guid>{3299869E-A058-432A-9761-21F551D0610B}</b:Guid>
-    <b:Title>Von der Idee zum Text. Eine Anleitung zum wissenschaftlichen Schreiben</b:Title>
-    <b:Year>2008</b:Year>
-    <b:Publisher>Schöningh</b:Publisher>
-    <b:City> Paderborn</b:City>
-    <b:Author>
-      <b:Author>
-        <b:NameList>
-          <b:Person>
-            <b:Last>Esselborn-Krumbiegel</b:Last>
-            <b:First>Helga</b:First>
-          </b:Person>
-        </b:NameList>
-      </b:Author>
-    </b:Author>
-    <b:Edition>3. überarb. Aufl</b:Edition>
-    <b:RefOrder>3</b:RefOrder>
-  </b:Source>
-</b:Sources>
-</file>
-
 <file path=customXml/itemProps1.xml><?xml version="1.0" encoding="utf-8"?>
-<ds:datastoreItem xmlns:ds="http://schemas.openxmlformats.org/officeDocument/2006/customXml" ds:itemID="{B3A0B843-25C3-4DBE-9C50-732B0310038B}">
-  <ds:schemaRefs>
-    <ds:schemaRef ds:uri="http://schemas.microsoft.com/sharepoint/v3/contenttype/forms"/>
-  </ds:schemaRefs>
-</ds:datastoreItem>
-</file>
-
-<file path=customXml/itemProps2.xml><?xml version="1.0" encoding="utf-8"?>
 <ds:datastoreItem xmlns:ds="http://schemas.openxmlformats.org/officeDocument/2006/customXml" ds:itemID="{01CD615F-850E-4244-A790-55B60DB07CE2}">
   <ds:schemaRefs>
     <ds:schemaRef ds:uri="http://schemas.microsoft.com/office/2006/metadata/properties"/>
@@ -8059,7 +8880,23 @@
 </ds:datastoreItem>
 </file>
 
+<file path=customXml/itemProps2.xml><?xml version="1.0" encoding="utf-8"?>
+<ds:datastoreItem xmlns:ds="http://schemas.openxmlformats.org/officeDocument/2006/customXml" ds:itemID="{B3A0B843-25C3-4DBE-9C50-732B0310038B}">
+  <ds:schemaRefs>
+    <ds:schemaRef ds:uri="http://schemas.microsoft.com/sharepoint/v3/contenttype/forms"/>
+  </ds:schemaRefs>
+</ds:datastoreItem>
+</file>
+
 <file path=customXml/itemProps3.xml><?xml version="1.0" encoding="utf-8"?>
+<ds:datastoreItem xmlns:ds="http://schemas.openxmlformats.org/officeDocument/2006/customXml" ds:itemID="{851A0523-2E87-4707-90E2-48F24DA64E56}">
+  <ds:schemaRefs>
+    <ds:schemaRef ds:uri="http://schemas.openxmlformats.org/officeDocument/2006/bibliography"/>
+  </ds:schemaRefs>
+</ds:datastoreItem>
+</file>
+
+<file path=customXml/itemProps4.xml><?xml version="1.0" encoding="utf-8"?>
 <ds:datastoreItem xmlns:ds="http://schemas.openxmlformats.org/officeDocument/2006/customXml" ds:itemID="{B95865E5-B0D5-4E59-9C7E-3E2B14D43C20}">
   <ds:schemaRefs>
     <ds:schemaRef ds:uri="http://schemas.microsoft.com/office/2006/metadata/contentType"/>
@@ -8076,12 +8913,4 @@
     <ds:schemaRef ds:uri="http://schemas.microsoft.com/internal/obd"/>
   </ds:schemaRefs>
 </ds:datastoreItem>
-</file>
-
-<file path=customXml/itemProps4.xml><?xml version="1.0" encoding="utf-8"?>
-<ds:datastoreItem xmlns:ds="http://schemas.openxmlformats.org/officeDocument/2006/customXml" ds:itemID="{851A0523-2E87-4707-90E2-48F24DA64E56}">
-  <ds:schemaRefs>
-    <ds:schemaRef ds:uri="http://schemas.openxmlformats.org/officeDocument/2006/bibliography"/>
-  </ds:schemaRefs>
-</ds:datastoreItem>
 </file>
</xml_diff>

<commit_message>
Added use-case seasonal ticket description
</commit_message>
<xml_diff>
--- a/TurboTicketTornado/SWD-Project-Template.docx
+++ b/TurboTicketTornado/SWD-Project-Template.docx
@@ -430,6 +430,7 @@
             <w:rPr>
               <w:rStyle w:val="Enlacedelndice"/>
               <w:rFonts w:cs="Calibri"/>
+              <w:vanish w:val="false"/>
               <w:webHidden/>
             </w:rPr>
             <w:instrText xml:space="preserve"> TOC \z \o "1-3" \u \h</w:instrText>
@@ -438,6 +439,7 @@
             <w:rPr>
               <w:rStyle w:val="Enlacedelndice"/>
               <w:rFonts w:cs="Calibri"/>
+              <w:vanish w:val="false"/>
               <w:webHidden/>
             </w:rPr>
             <w:fldChar w:fldCharType="separate"/>
@@ -447,6 +449,7 @@
               <w:rPr>
                 <w:rStyle w:val="Enlacedelndice"/>
                 <w:rFonts w:cs="Calibri" w:cstheme="minorHAnsi"/>
+                <w:vanish w:val="false"/>
                 <w:webHidden/>
               </w:rPr>
               <w:t>1</w:t>
@@ -521,6 +524,7 @@
               <w:rPr>
                 <w:rStyle w:val="Enlacedelndice"/>
                 <w:rFonts w:cs="Calibri" w:cstheme="minorHAnsi"/>
+                <w:vanish w:val="false"/>
                 <w:webHidden/>
               </w:rPr>
               <w:t>1.1</w:t>
@@ -593,6 +597,7 @@
             <w:r>
               <w:rPr>
                 <w:rStyle w:val="Enlacedelndice"/>
+                <w:vanish w:val="false"/>
                 <w:webHidden/>
               </w:rPr>
               <w:t>1.1.1</w:t>
@@ -664,6 +669,7 @@
               <w:rPr>
                 <w:rStyle w:val="Enlacedelndice"/>
                 <w:rFonts w:cs="Calibri" w:cstheme="minorHAnsi"/>
+                <w:vanish w:val="false"/>
                 <w:webHidden/>
               </w:rPr>
               <w:t>1.1.2</w:t>
@@ -736,6 +742,7 @@
               <w:rPr>
                 <w:rStyle w:val="Enlacedelndice"/>
                 <w:rFonts w:cs="Calibri" w:cstheme="minorHAnsi"/>
+                <w:vanish w:val="false"/>
                 <w:webHidden/>
               </w:rPr>
               <w:t>1.1.3</w:t>
@@ -808,6 +815,7 @@
               <w:rPr>
                 <w:rStyle w:val="Enlacedelndice"/>
                 <w:rFonts w:cs="Calibri" w:cstheme="minorHAnsi"/>
+                <w:vanish w:val="false"/>
                 <w:webHidden/>
               </w:rPr>
               <w:t>1.1.4</w:t>
@@ -881,6 +889,7 @@
               <w:rPr>
                 <w:rStyle w:val="Enlacedelndice"/>
                 <w:rFonts w:cs="Calibri" w:cstheme="minorHAnsi"/>
+                <w:vanish w:val="false"/>
                 <w:webHidden/>
               </w:rPr>
               <w:t>1.2</w:t>
@@ -955,6 +964,7 @@
               <w:rPr>
                 <w:rStyle w:val="Enlacedelndice"/>
                 <w:rFonts w:cs="Calibri" w:cstheme="minorHAnsi"/>
+                <w:vanish w:val="false"/>
                 <w:webHidden/>
               </w:rPr>
               <w:t>1.3</w:t>
@@ -1028,6 +1038,7 @@
               <w:rPr>
                 <w:rStyle w:val="Enlacedelndice"/>
                 <w:rFonts w:cs="Calibri" w:cstheme="minorHAnsi"/>
+                <w:vanish w:val="false"/>
                 <w:webHidden/>
               </w:rPr>
               <w:t>1.3.1</w:t>
@@ -1100,6 +1111,7 @@
               <w:rPr>
                 <w:rStyle w:val="Enlacedelndice"/>
                 <w:rFonts w:cs="Calibri" w:cstheme="minorHAnsi"/>
+                <w:vanish w:val="false"/>
                 <w:webHidden/>
               </w:rPr>
               <w:t>1.3.2</w:t>
@@ -1171,6 +1183,7 @@
             <w:r>
               <w:rPr>
                 <w:rStyle w:val="Enlacedelndice"/>
+                <w:vanish w:val="false"/>
                 <w:webHidden/>
               </w:rPr>
               <w:t>1.3.3</w:t>
@@ -1243,6 +1256,7 @@
               <w:rPr>
                 <w:rStyle w:val="Enlacedelndice"/>
                 <w:rFonts w:cs="Calibri" w:cstheme="minorHAnsi"/>
+                <w:vanish w:val="false"/>
                 <w:webHidden/>
               </w:rPr>
               <w:t>2</w:t>
@@ -1317,6 +1331,7 @@
               <w:rPr>
                 <w:rStyle w:val="Enlacedelndice"/>
                 <w:rFonts w:cs="Calibri" w:cstheme="minorHAnsi"/>
+                <w:vanish w:val="false"/>
                 <w:webHidden/>
               </w:rPr>
               <w:t>2.1</w:t>
@@ -1391,6 +1406,7 @@
               <w:rPr>
                 <w:rStyle w:val="Enlacedelndice"/>
                 <w:rFonts w:cs="Calibri" w:cstheme="minorHAnsi"/>
+                <w:vanish w:val="false"/>
                 <w:webHidden/>
               </w:rPr>
               <w:t>2.2</w:t>
@@ -1464,6 +1480,7 @@
               <w:rPr>
                 <w:rStyle w:val="Enlacedelndice"/>
                 <w:rFonts w:cs="Calibri" w:cstheme="minorHAnsi"/>
+                <w:vanish w:val="false"/>
                 <w:webHidden/>
               </w:rPr>
               <w:t>2.2.1</w:t>
@@ -1536,6 +1553,7 @@
               <w:rPr>
                 <w:rStyle w:val="Enlacedelndice"/>
                 <w:rFonts w:cs="Calibri" w:cstheme="minorHAnsi"/>
+                <w:vanish w:val="false"/>
                 <w:webHidden/>
               </w:rPr>
               <w:t>2.2.2</w:t>
@@ -1609,6 +1627,7 @@
               <w:rPr>
                 <w:rStyle w:val="Enlacedelndice"/>
                 <w:rFonts w:cs="Calibri" w:cstheme="minorHAnsi"/>
+                <w:vanish w:val="false"/>
                 <w:webHidden/>
               </w:rPr>
               <w:t>2.3</w:t>
@@ -1682,6 +1701,7 @@
               <w:rPr>
                 <w:rStyle w:val="Enlacedelndice"/>
                 <w:rFonts w:cs="Calibri" w:cstheme="minorHAnsi"/>
+                <w:vanish w:val="false"/>
                 <w:webHidden/>
               </w:rPr>
               <w:t>2.3.1</w:t>
@@ -1754,6 +1774,7 @@
               <w:rPr>
                 <w:rStyle w:val="Enlacedelndice"/>
                 <w:rFonts w:cs="Calibri" w:cstheme="minorHAnsi"/>
+                <w:vanish w:val="false"/>
                 <w:webHidden/>
               </w:rPr>
               <w:t>2.3.2</w:t>
@@ -1827,6 +1848,7 @@
               <w:rPr>
                 <w:rStyle w:val="Enlacedelndice"/>
                 <w:rFonts w:cs="Calibri" w:cstheme="minorHAnsi"/>
+                <w:vanish w:val="false"/>
                 <w:webHidden/>
                 <w:lang w:val="en-US"/>
               </w:rPr>
@@ -1903,6 +1925,7 @@
               <w:rPr>
                 <w:rStyle w:val="Enlacedelndice"/>
                 <w:rFonts w:cs="Calibri" w:cstheme="minorHAnsi"/>
+                <w:vanish w:val="false"/>
                 <w:webHidden/>
                 <w:lang w:val="en-US"/>
               </w:rPr>
@@ -1978,6 +2001,7 @@
             <w:r>
               <w:rPr>
                 <w:rStyle w:val="Enlacedelndice"/>
+                <w:vanish w:val="false"/>
                 <w:webHidden/>
                 <w:lang w:val="en-US"/>
               </w:rPr>
@@ -2059,6 +2083,7 @@
               <w:rPr>
                 <w:rStyle w:val="Enlacedelndice"/>
                 <w:rFonts w:cs="Calibri" w:cstheme="minorHAnsi"/>
+                <w:vanish w:val="false"/>
                 <w:webHidden/>
                 <w:lang w:val="en-US"/>
               </w:rPr>
@@ -2135,6 +2160,7 @@
               <w:rPr>
                 <w:rStyle w:val="Enlacedelndice"/>
                 <w:rFonts w:cs="Calibri" w:cstheme="minorHAnsi"/>
+                <w:vanish w:val="false"/>
                 <w:webHidden/>
                 <w:lang w:val="en-US"/>
               </w:rPr>
@@ -2197,6 +2223,7 @@
         <w:p>
           <w:pPr>
             <w:pStyle w:val="TOC1"/>
+            <w:spacing w:before="0" w:after="120"/>
             <w:rPr>
               <w:rFonts w:ascii="Calibri" w:hAnsi="Calibri" w:eastAsia="" w:cs="" w:asciiTheme="minorHAnsi" w:cstheme="minorBidi" w:eastAsiaTheme="minorEastAsia" w:hAnsiTheme="minorHAnsi"/>
               <w:b w:val="false"/>
@@ -2211,6 +2238,7 @@
               <w:rPr>
                 <w:rStyle w:val="Enlacedelndice"/>
                 <w:rFonts w:cs="Calibri" w:cstheme="minorHAnsi"/>
+                <w:vanish w:val="false"/>
                 <w:webHidden/>
                 <w:lang w:val="en-US"/>
               </w:rPr>
@@ -2277,34 +2305,24 @@
             <w:fldChar w:fldCharType="end"/>
           </w:r>
         </w:p>
+        <w:p>
+          <w:pPr>
+            <w:sectPr>
+              <w:headerReference w:type="even" r:id="rId6"/>
+              <w:headerReference w:type="default" r:id="rId7"/>
+              <w:headerReference w:type="first" r:id="rId8"/>
+              <w:type w:val="nextPage"/>
+              <w:pgSz w:w="11906" w:h="16838"/>
+              <w:pgMar w:left="1418" w:right="1418" w:gutter="284" w:header="851" w:top="1418" w:footer="0" w:bottom="1134"/>
+              <w:pgNumType w:start="1" w:fmt="lowerRoman"/>
+              <w:formProt w:val="false"/>
+              <w:textDirection w:val="lrTb"/>
+              <w:docGrid w:type="default" w:linePitch="360" w:charSpace="0"/>
+            </w:sectPr>
+          </w:pPr>
+        </w:p>
       </w:sdtContent>
     </w:sdt>
-    <w:p>
-      <w:pPr>
-        <w:pStyle w:val="Normal"/>
-        <w:spacing w:before="0" w:after="120"/>
-        <w:rPr>
-          <w:rFonts w:ascii="Calibri" w:hAnsi="Calibri" w:cs="Calibri" w:asciiTheme="minorHAnsi" w:cstheme="minorHAnsi" w:hAnsiTheme="minorHAnsi"/>
-        </w:rPr>
-        <w:sectPr>
-          <w:headerReference w:type="even" r:id="rId6"/>
-          <w:headerReference w:type="default" r:id="rId7"/>
-          <w:headerReference w:type="first" r:id="rId8"/>
-          <w:type w:val="nextPage"/>
-          <w:pgSz w:w="11906" w:h="16838"/>
-          <w:pgMar w:left="1418" w:right="1418" w:gutter="284" w:header="851" w:top="1418" w:footer="0" w:bottom="1134"/>
-          <w:pgNumType w:start="1" w:fmt="lowerRoman"/>
-          <w:formProt w:val="false"/>
-          <w:textDirection w:val="lrTb"/>
-          <w:docGrid w:type="default" w:linePitch="360" w:charSpace="0"/>
-        </w:sectPr>
-      </w:pPr>
-      <w:r>
-        <w:rPr>
-          <w:rFonts w:cs="Calibri" w:cstheme="minorHAnsi"/>
-        </w:rPr>
-      </w:r>
-    </w:p>
     <w:p>
       <w:pPr>
         <w:pStyle w:val="Heading1"/>
@@ -2334,8 +2352,8 @@
           <w:rFonts w:ascii="Calibri" w:hAnsi="Calibri" w:cs="Calibri" w:asciiTheme="minorHAnsi" w:cstheme="minorHAnsi" w:hAnsiTheme="minorHAnsi"/>
         </w:rPr>
       </w:pPr>
-      <w:bookmarkStart w:id="2" w:name="_Toc242430078"/>
-      <w:bookmarkStart w:id="3" w:name="_Toc75855924"/>
+      <w:bookmarkStart w:id="2" w:name="_Toc75855924"/>
+      <w:bookmarkStart w:id="3" w:name="_Toc242430078"/>
       <w:r>
         <w:rPr>
           <w:rFonts w:cs="Calibri" w:cstheme="minorHAnsi"/>
@@ -3499,8 +3517,8 @@
           <w:rFonts w:ascii="Calibri" w:hAnsi="Calibri" w:cs="Calibri" w:asciiTheme="minorHAnsi" w:cstheme="minorHAnsi" w:hAnsiTheme="minorHAnsi"/>
         </w:rPr>
       </w:pPr>
-      <w:bookmarkStart w:id="8" w:name="_Toc242430083"/>
-      <w:bookmarkStart w:id="9" w:name="_Toc75855925"/>
+      <w:bookmarkStart w:id="8" w:name="_Toc75855925"/>
+      <w:bookmarkStart w:id="9" w:name="_Toc242430083"/>
       <w:r>
         <w:rPr>
           <w:rFonts w:cs="Calibri" w:cstheme="minorHAnsi"/>
@@ -3521,8 +3539,8 @@
           <w:rFonts w:ascii="Calibri" w:hAnsi="Calibri" w:cs="Calibri" w:asciiTheme="minorHAnsi" w:cstheme="minorHAnsi" w:hAnsiTheme="minorHAnsi"/>
         </w:rPr>
       </w:pPr>
-      <w:bookmarkStart w:id="10" w:name="_Toc242430084"/>
-      <w:bookmarkStart w:id="11" w:name="_Toc75855926"/>
+      <w:bookmarkStart w:id="10" w:name="_Toc75855926"/>
+      <w:bookmarkStart w:id="11" w:name="_Toc242430084"/>
       <w:r>
         <w:rPr>
           <w:rFonts w:cs="Calibri" w:cstheme="minorHAnsi"/>
@@ -4035,8 +4053,8 @@
           <w:rFonts w:ascii="Calibri" w:hAnsi="Calibri" w:cs="Calibri" w:asciiTheme="minorHAnsi" w:cstheme="minorHAnsi" w:hAnsiTheme="minorHAnsi"/>
         </w:rPr>
       </w:pPr>
-      <w:bookmarkStart w:id="16" w:name="_Toc242430089"/>
-      <w:bookmarkStart w:id="17" w:name="_Toc75855927"/>
+      <w:bookmarkStart w:id="16" w:name="_Toc75855927"/>
+      <w:bookmarkStart w:id="17" w:name="_Toc242430089"/>
       <w:r>
         <w:rPr>
           <w:rFonts w:cs="Calibri" w:cstheme="minorHAnsi"/>
@@ -4057,8 +4075,8 @@
           <w:rFonts w:ascii="Calibri" w:hAnsi="Calibri" w:cs="Calibri" w:asciiTheme="minorHAnsi" w:cstheme="minorHAnsi" w:hAnsiTheme="minorHAnsi"/>
         </w:rPr>
       </w:pPr>
-      <w:bookmarkStart w:id="18" w:name="_Toc242430090"/>
-      <w:bookmarkStart w:id="19" w:name="_Toc75855928"/>
+      <w:bookmarkStart w:id="18" w:name="_Toc75855928"/>
+      <w:bookmarkStart w:id="19" w:name="_Toc242430090"/>
       <w:r>
         <w:rPr>
           <w:rFonts w:cs="Calibri" w:cstheme="minorHAnsi"/>
@@ -4124,8 +4142,8 @@
           <w:rFonts w:ascii="Calibri" w:hAnsi="Calibri" w:cs="Calibri" w:asciiTheme="minorHAnsi" w:cstheme="minorHAnsi" w:hAnsiTheme="minorHAnsi"/>
         </w:rPr>
       </w:pPr>
-      <w:bookmarkStart w:id="22" w:name="_Toc242430093"/>
-      <w:bookmarkStart w:id="23" w:name="_Toc75855929"/>
+      <w:bookmarkStart w:id="22" w:name="_Toc75855929"/>
+      <w:bookmarkStart w:id="23" w:name="_Toc242430093"/>
       <w:r>
         <w:rPr>
           <w:rFonts w:cs="Calibri" w:cstheme="minorHAnsi"/>
@@ -4179,6 +4197,478 @@
           <w:rFonts w:cs="Calibri" w:cstheme="minorHAnsi"/>
         </w:rPr>
       </w:r>
+    </w:p>
+    <w:p>
+      <w:pPr>
+        <w:pStyle w:val="US2Kapitel"/>
+        <w:numPr>
+          <w:ilvl w:val="1"/>
+          <w:numId w:val="1"/>
+        </w:numPr>
+        <w:rPr>
+          <w:rFonts w:ascii="Calibri" w:hAnsi="Calibri" w:cs="Calibri" w:asciiTheme="minorHAnsi" w:cstheme="minorHAnsi" w:hAnsiTheme="minorHAnsi"/>
+        </w:rPr>
+      </w:pPr>
+      <w:bookmarkStart w:id="26" w:name="_Toc75855929_Copia_1"/>
+      <w:bookmarkStart w:id="27" w:name="_Toc242430093_Copia_1"/>
+      <w:r>
+        <w:rPr>
+          <w:rFonts w:cs="Calibri" w:cstheme="minorHAnsi"/>
+        </w:rPr>
+        <w:t xml:space="preserve">Use Case </w:t>
+      </w:r>
+      <w:r>
+        <w:rPr>
+          <w:rFonts w:cs="Calibri" w:cstheme="minorHAnsi"/>
+        </w:rPr>
+        <w:t>3</w:t>
+      </w:r>
+      <w:r>
+        <w:rPr>
+          <w:rFonts w:cs="Calibri" w:cstheme="minorHAnsi"/>
+        </w:rPr>
+        <w:t xml:space="preserve"> </w:t>
+      </w:r>
+      <w:bookmarkEnd w:id="26"/>
+      <w:bookmarkEnd w:id="27"/>
+      <w:r>
+        <w:rPr>
+          <w:rFonts w:cs="Calibri" w:cstheme="minorHAnsi"/>
+        </w:rPr>
+        <w:t>Seasonal Ticket</w:t>
+      </w:r>
+    </w:p>
+    <w:p>
+      <w:pPr>
+        <w:pStyle w:val="Heading3"/>
+        <w:rPr>
+          <w:rFonts w:ascii="Calibri" w:hAnsi="Calibri" w:cs="Calibri" w:asciiTheme="minorHAnsi" w:cstheme="minorHAnsi" w:hAnsiTheme="minorHAnsi"/>
+        </w:rPr>
+      </w:pPr>
+      <w:bookmarkStart w:id="28" w:name="_Toc242430094_Copia_1"/>
+      <w:r>
+        <w:rPr>
+          <w:rFonts w:cs="Calibri" w:cstheme="minorHAnsi"/>
+        </w:rPr>
+        <w:t>Use Case Description</w:t>
+      </w:r>
+      <w:bookmarkEnd w:id="28"/>
+    </w:p>
+    <w:p>
+      <w:pPr>
+        <w:pStyle w:val="Normal"/>
+        <w:rPr>
+          <w:rFonts w:ascii="Calibri" w:hAnsi="Calibri" w:cs="Calibri" w:asciiTheme="minorHAnsi" w:cstheme="minorHAnsi" w:hAnsiTheme="minorHAnsi"/>
+        </w:rPr>
+      </w:pPr>
+      <w:r>
+        <w:rPr>
+          <w:rFonts w:cs="Calibri" w:cstheme="minorHAnsi"/>
+        </w:rPr>
+        <w:t xml:space="preserve">- Allows a user to buy a seasonal ticket for a competition. </w:t>
+      </w:r>
+    </w:p>
+    <w:tbl>
+      <w:tblPr>
+        <w:tblW w:w="8786" w:type="dxa"/>
+        <w:jc w:val="start"/>
+        <w:tblInd w:w="0" w:type="dxa"/>
+        <w:tblLayout w:type="fixed"/>
+        <w:tblCellMar>
+          <w:top w:w="28" w:type="dxa"/>
+          <w:start w:w="28" w:type="dxa"/>
+          <w:bottom w:w="28" w:type="dxa"/>
+          <w:end w:w="28" w:type="dxa"/>
+        </w:tblCellMar>
+      </w:tblPr>
+      <w:tblGrid>
+        <w:gridCol w:w="1801"/>
+        <w:gridCol w:w="6985"/>
+      </w:tblGrid>
+      <w:tr>
+        <w:trPr/>
+        <w:tc>
+          <w:tcPr>
+            <w:tcW w:w="1801" w:type="dxa"/>
+            <w:tcBorders/>
+            <w:vAlign w:val="center"/>
+          </w:tcPr>
+          <w:p>
+            <w:pPr>
+              <w:pStyle w:val="Contenidodelatabla"/>
+              <w:widowControl w:val="false"/>
+              <w:suppressLineNumbers/>
+              <w:spacing w:before="0" w:after="120"/>
+              <w:rPr/>
+            </w:pPr>
+            <w:r>
+              <w:rPr>
+                <w:rStyle w:val="Strong"/>
+                <w:rFonts w:ascii="Calibri" w:hAnsi="Calibri"/>
+              </w:rPr>
+              <w:t>Trigger</w:t>
+            </w:r>
+          </w:p>
+        </w:tc>
+        <w:tc>
+          <w:tcPr>
+            <w:tcW w:w="6985" w:type="dxa"/>
+            <w:tcBorders/>
+            <w:vAlign w:val="center"/>
+          </w:tcPr>
+          <w:p>
+            <w:pPr>
+              <w:pStyle w:val="Contenidodelatabla"/>
+              <w:spacing w:lineRule="auto" w:line="276" w:before="0" w:after="120"/>
+              <w:rPr>
+                <w:rFonts w:ascii="Calibri" w:hAnsi="Calibri"/>
+              </w:rPr>
+            </w:pPr>
+            <w:r>
+              <w:rPr>
+                <w:rFonts w:ascii="Calibri" w:hAnsi="Calibri"/>
+              </w:rPr>
+              <w:t>The customer selects “Buy season ticket” in a client (web, app, kiosk or POS).</w:t>
+            </w:r>
+          </w:p>
+        </w:tc>
+      </w:tr>
+      <w:tr>
+        <w:trPr>
+          <w:trHeight w:val="1880" w:hRule="atLeast"/>
+        </w:trPr>
+        <w:tc>
+          <w:tcPr>
+            <w:tcW w:w="1801" w:type="dxa"/>
+            <w:tcBorders/>
+            <w:vAlign w:val="center"/>
+          </w:tcPr>
+          <w:p>
+            <w:pPr>
+              <w:pStyle w:val="Contenidodelatabla"/>
+              <w:widowControl w:val="false"/>
+              <w:suppressLineNumbers/>
+              <w:spacing w:before="0" w:after="120"/>
+              <w:rPr/>
+            </w:pPr>
+            <w:r>
+              <w:rPr>
+                <w:rStyle w:val="Strong"/>
+                <w:rFonts w:ascii="Calibri" w:hAnsi="Calibri"/>
+              </w:rPr>
+              <w:t>Pre-conditions</w:t>
+            </w:r>
+          </w:p>
+        </w:tc>
+        <w:tc>
+          <w:tcPr>
+            <w:tcW w:w="6985" w:type="dxa"/>
+            <w:tcBorders/>
+            <w:vAlign w:val="center"/>
+          </w:tcPr>
+          <w:p>
+            <w:pPr>
+              <w:pStyle w:val="Contenidodelatabla"/>
+              <w:spacing w:lineRule="auto" w:line="276" w:before="0" w:after="120"/>
+              <w:rPr>
+                <w:rFonts w:ascii="Calibri" w:hAnsi="Calibri"/>
+              </w:rPr>
+            </w:pPr>
+            <w:r>
+              <w:rPr>
+                <w:rFonts w:ascii="Calibri" w:hAnsi="Calibri"/>
+              </w:rPr>
+              <w:t>1. The customer has a registered account and is logged in. 2. The customer has exactly one customer type assigned (regular, reduced-price, fan club member). 3. At least one competition/series with home matches is open for season ticket sales. 4. Stadium sectors, seats and prices per sector and competition type are defined in the system.</w:t>
+            </w:r>
+          </w:p>
+        </w:tc>
+      </w:tr>
+      <w:tr>
+        <w:trPr>
+          <w:trHeight w:val="1880" w:hRule="atLeast"/>
+        </w:trPr>
+        <w:tc>
+          <w:tcPr>
+            <w:tcW w:w="1801" w:type="dxa"/>
+            <w:tcBorders/>
+            <w:vAlign w:val="center"/>
+          </w:tcPr>
+          <w:p>
+            <w:pPr>
+              <w:pStyle w:val="Contenidodelatabla"/>
+              <w:spacing w:before="0" w:after="120"/>
+              <w:rPr>
+                <w:rFonts w:ascii="Calibri" w:hAnsi="Calibri"/>
+                <w:b/>
+                <w:bCs/>
+              </w:rPr>
+            </w:pPr>
+            <w:r>
+              <w:rPr>
+                <w:rFonts w:ascii="Calibri" w:hAnsi="Calibri"/>
+                <w:b/>
+                <w:bCs/>
+              </w:rPr>
+              <w:t xml:space="preserve">Post-conditions (success) </w:t>
+            </w:r>
+          </w:p>
+        </w:tc>
+        <w:tc>
+          <w:tcPr>
+            <w:tcW w:w="6985" w:type="dxa"/>
+            <w:tcBorders/>
+            <w:vAlign w:val="center"/>
+          </w:tcPr>
+          <w:p>
+            <w:pPr>
+              <w:pStyle w:val="Contenidodelatabla"/>
+              <w:spacing w:lineRule="auto" w:line="276" w:before="0" w:after="120"/>
+              <w:rPr>
+                <w:rFonts w:ascii="Calibri" w:hAnsi="Calibri"/>
+              </w:rPr>
+            </w:pPr>
+            <w:r>
+              <w:rPr>
+                <w:rFonts w:ascii="Calibri" w:hAnsi="Calibri"/>
+              </w:rPr>
+              <w:t xml:space="preserve">A season ticket exists, linked to the customer, the seat and the competition/series. The seat is shown as sold for every match of that competition, both for season and single-match sales. The payment is registered. </w:t>
+            </w:r>
+          </w:p>
+        </w:tc>
+      </w:tr>
+    </w:tbl>
+    <w:p>
+      <w:pPr>
+        <w:pStyle w:val="Normal"/>
+        <w:rPr>
+          <w:rFonts w:ascii="Calibri" w:hAnsi="Calibri" w:cs="Calibri" w:asciiTheme="minorHAnsi" w:cstheme="minorHAnsi" w:hAnsiTheme="minorHAnsi"/>
+        </w:rPr>
+      </w:pPr>
+      <w:r>
+        <w:rPr>
+          <w:rFonts w:cs="Calibri" w:cstheme="minorHAnsi"/>
+        </w:rPr>
+      </w:r>
+    </w:p>
+    <w:p>
+      <w:pPr>
+        <w:pStyle w:val="Heading3"/>
+        <w:rPr>
+          <w:rFonts w:ascii="Calibri" w:hAnsi="Calibri" w:cs="Calibri" w:asciiTheme="minorHAnsi" w:cstheme="minorHAnsi" w:hAnsiTheme="minorHAnsi"/>
+        </w:rPr>
+      </w:pPr>
+      <w:bookmarkStart w:id="29" w:name="_Toc242430095_Copia_1"/>
+      <w:r>
+        <w:rPr>
+          <w:rFonts w:cstheme="minorHAnsi"/>
+        </w:rPr>
+        <w:t>Activity Diagram</w:t>
+      </w:r>
+      <w:bookmarkEnd w:id="29"/>
+    </w:p>
+    <w:p>
+      <w:pPr>
+        <w:pStyle w:val="Normal"/>
+        <w:rPr>
+          <w:rFonts w:ascii="Calibri" w:hAnsi="Calibri" w:cs="Calibri" w:asciiTheme="minorHAnsi" w:cstheme="minorHAnsi" w:hAnsiTheme="minorHAnsi"/>
+        </w:rPr>
+      </w:pPr>
+      <w:r>
+        <w:rPr>
+          <w:rFonts w:cstheme="minorHAnsi"/>
+        </w:rPr>
+        <w:drawing>
+          <wp:anchor distT="0" distB="0" distL="0" distR="0" simplePos="0" relativeHeight="3" behindDoc="0" locked="0" layoutInCell="0" allowOverlap="1">
+            <wp:simplePos x="0" y="0"/>
+            <wp:positionH relativeFrom="column">
+              <wp:posOffset>71120</wp:posOffset>
+            </wp:positionH>
+            <wp:positionV relativeFrom="paragraph">
+              <wp:posOffset>67945</wp:posOffset>
+            </wp:positionV>
+            <wp:extent cx="5382895" cy="2962275"/>
+            <wp:effectExtent l="0" t="0" r="0" b="0"/>
+            <wp:wrapSquare wrapText="largest"/>
+            <wp:docPr id="2" name="Imagen1"/>
+            <wp:cNvGraphicFramePr>
+              <a:graphicFrameLocks xmlns:a="http://schemas.openxmlformats.org/drawingml/2006/main" noChangeAspect="1"/>
+            </wp:cNvGraphicFramePr>
+            <a:graphic xmlns:a="http://schemas.openxmlformats.org/drawingml/2006/main">
+              <a:graphicData uri="http://schemas.openxmlformats.org/drawingml/2006/picture">
+                <pic:pic xmlns:pic="http://schemas.openxmlformats.org/drawingml/2006/picture">
+                  <pic:nvPicPr>
+                    <pic:cNvPr id="2" name="Imagen1"/>
+                    <pic:cNvPicPr>
+                      <a:picLocks noChangeAspect="1" noChangeArrowheads="1"/>
+                    </pic:cNvPicPr>
+                  </pic:nvPicPr>
+                  <pic:blipFill>
+                    <a:blip r:embed="rId9"/>
+                    <a:srcRect l="0" t="4877" r="3517" b="6443"/>
+                    <a:stretch>
+                      <a:fillRect/>
+                    </a:stretch>
+                  </pic:blipFill>
+                  <pic:spPr bwMode="auto">
+                    <a:xfrm>
+                      <a:off x="0" y="0"/>
+                      <a:ext cx="5382895" cy="2962275"/>
+                    </a:xfrm>
+                    <a:prstGeom prst="rect">
+                      <a:avLst/>
+                    </a:prstGeom>
+                    <a:noFill/>
+                  </pic:spPr>
+                </pic:pic>
+              </a:graphicData>
+            </a:graphic>
+          </wp:anchor>
+        </w:drawing>
+      </w:r>
+      <w:r>
+        <w:br w:type="page"/>
+      </w:r>
+    </w:p>
+    <w:p>
+      <w:pPr>
+        <w:pStyle w:val="Heading1"/>
+        <w:spacing w:before="0" w:after="120"/>
+        <w:rPr>
+          <w:rFonts w:ascii="Calibri" w:hAnsi="Calibri" w:cs="Calibri" w:asciiTheme="minorHAnsi" w:cstheme="minorHAnsi" w:hAnsiTheme="minorHAnsi"/>
+          <w:lang w:val="en-US"/>
+        </w:rPr>
+      </w:pPr>
+      <w:bookmarkStart w:id="30" w:name="_Toc242430096"/>
+      <w:r>
+        <w:rPr>
+          <w:rFonts w:cs="Calibri" w:cstheme="minorHAnsi"/>
+          <w:lang w:val="en-US"/>
+        </w:rPr>
+        <w:t>Architecture</w:t>
+      </w:r>
+      <w:bookmarkEnd w:id="30"/>
+    </w:p>
+    <w:p>
+      <w:pPr>
+        <w:pStyle w:val="US2Kapitel"/>
+        <w:numPr>
+          <w:ilvl w:val="1"/>
+          <w:numId w:val="1"/>
+        </w:numPr>
+        <w:rPr>
+          <w:rFonts w:ascii="Calibri" w:hAnsi="Calibri" w:cs="Calibri" w:asciiTheme="minorHAnsi" w:cstheme="minorHAnsi" w:hAnsiTheme="minorHAnsi"/>
+          <w:lang w:val="en-US"/>
+        </w:rPr>
+      </w:pPr>
+      <w:bookmarkStart w:id="31" w:name="_Toc75855931"/>
+      <w:bookmarkStart w:id="32" w:name="_Toc242430097"/>
+      <w:r>
+        <w:rPr>
+          <w:rFonts w:cs="Calibri" w:cstheme="minorHAnsi"/>
+          <w:lang w:val="en-US"/>
+        </w:rPr>
+        <w:t>Component Diagram</w:t>
+      </w:r>
+      <w:bookmarkEnd w:id="31"/>
+      <w:bookmarkEnd w:id="32"/>
+    </w:p>
+    <w:p>
+      <w:pPr>
+        <w:pStyle w:val="Normal"/>
+        <w:spacing w:lineRule="auto" w:line="240" w:before="0" w:after="0"/>
+        <w:ind w:hanging="357" w:start="357"/>
+        <w:jc w:val="start"/>
+        <w:rPr>
+          <w:rFonts w:eastAsia="Times New Roman" w:cs="" w:cstheme="minorBidi"/>
+          <w:b/>
+          <w:bCs/>
+          <w:sz w:val="28"/>
+          <w:szCs w:val="28"/>
+          <w:lang w:val="en-US"/>
+        </w:rPr>
+      </w:pPr>
+      <w:r>
+        <w:rPr>
+          <w:rFonts w:eastAsia="Times New Roman" w:cs="" w:cstheme="minorBidi"/>
+          <w:b/>
+          <w:bCs/>
+          <w:sz w:val="28"/>
+          <w:szCs w:val="28"/>
+          <w:lang w:val="en-US"/>
+        </w:rPr>
+      </w:r>
+      <w:r>
+        <w:br w:type="page"/>
+      </w:r>
+    </w:p>
+    <w:p>
+      <w:pPr>
+        <w:pStyle w:val="Heading1"/>
+        <w:spacing w:before="0" w:after="120"/>
+        <w:rPr>
+          <w:lang w:val="en-US"/>
+        </w:rPr>
+      </w:pPr>
+      <w:bookmarkStart w:id="33" w:name="_Toc242430098"/>
+      <w:r>
+        <w:rPr>
+          <w:lang w:val="en-US"/>
+        </w:rPr>
+        <w:t>Impl</w:t>
+      </w:r>
+      <w:r>
+        <w:rPr/>
+        <w:t>ementation</w:t>
+      </w:r>
+      <w:bookmarkEnd w:id="33"/>
+    </w:p>
+    <w:p>
+      <w:pPr>
+        <w:pStyle w:val="US2Kapitel"/>
+        <w:numPr>
+          <w:ilvl w:val="1"/>
+          <w:numId w:val="1"/>
+        </w:numPr>
+        <w:rPr>
+          <w:rFonts w:ascii="Calibri" w:hAnsi="Calibri" w:cs="Calibri" w:asciiTheme="minorHAnsi" w:cstheme="minorHAnsi" w:hAnsiTheme="minorHAnsi"/>
+          <w:lang w:val="en-US"/>
+        </w:rPr>
+      </w:pPr>
+      <w:bookmarkStart w:id="34" w:name="_Toc75855932"/>
+      <w:bookmarkStart w:id="35" w:name="_Toc242430099"/>
+      <w:r>
+        <w:rPr>
+          <w:rFonts w:cs="Calibri" w:cstheme="minorHAnsi"/>
+          <w:lang w:val="en-US"/>
+        </w:rPr>
+        <w:t>Class Diagrams</w:t>
+      </w:r>
+      <w:bookmarkEnd w:id="34"/>
+      <w:bookmarkEnd w:id="35"/>
+    </w:p>
+    <w:p>
+      <w:pPr>
+        <w:pStyle w:val="US2Kapitel"/>
+        <w:numPr>
+          <w:ilvl w:val="1"/>
+          <w:numId w:val="1"/>
+        </w:numPr>
+        <w:rPr>
+          <w:rFonts w:ascii="Calibri" w:hAnsi="Calibri" w:cs="Calibri" w:asciiTheme="minorHAnsi" w:cstheme="minorHAnsi" w:hAnsiTheme="minorHAnsi"/>
+          <w:lang w:val="en-US"/>
+        </w:rPr>
+      </w:pPr>
+      <w:bookmarkStart w:id="36" w:name="_Toc75855933"/>
+      <w:bookmarkStart w:id="37" w:name="_Toc242430100"/>
+      <w:r>
+        <w:rPr>
+          <w:rFonts w:cs="Calibri" w:cstheme="minorHAnsi"/>
+          <w:lang w:val="en-US"/>
+        </w:rPr>
+        <w:t>Sequence Diagrams</w:t>
+      </w:r>
+      <w:bookmarkEnd w:id="36"/>
+      <w:bookmarkEnd w:id="37"/>
     </w:p>
     <w:p>
       <w:pPr>
@@ -4218,221 +4708,51 @@
           <w:lang w:val="en-US"/>
         </w:rPr>
       </w:pPr>
-      <w:bookmarkStart w:id="26" w:name="_Toc242430096"/>
+      <w:bookmarkStart w:id="38" w:name="_Toc242430101"/>
       <w:r>
         <w:rPr>
           <w:rFonts w:cs="Calibri" w:cstheme="minorHAnsi"/>
           <w:lang w:val="en-US"/>
         </w:rPr>
-        <w:t>Architecture</w:t>
-      </w:r>
-      <w:bookmarkEnd w:id="26"/>
-    </w:p>
-    <w:p>
-      <w:pPr>
-        <w:pStyle w:val="US2Kapitel"/>
-        <w:numPr>
-          <w:ilvl w:val="1"/>
-          <w:numId w:val="1"/>
-        </w:numPr>
+        <w:t>Conclusion</w:t>
+      </w:r>
+      <w:bookmarkEnd w:id="38"/>
+    </w:p>
+    <w:p>
+      <w:pPr>
+        <w:pStyle w:val="Normal"/>
         <w:rPr>
           <w:rFonts w:ascii="Calibri" w:hAnsi="Calibri" w:cs="Calibri" w:asciiTheme="minorHAnsi" w:cstheme="minorHAnsi" w:hAnsiTheme="minorHAnsi"/>
           <w:lang w:val="en-US"/>
         </w:rPr>
       </w:pPr>
-      <w:bookmarkStart w:id="27" w:name="_Toc242430097"/>
-      <w:bookmarkStart w:id="28" w:name="_Toc75855931"/>
       <w:r>
         <w:rPr>
           <w:rFonts w:cs="Calibri" w:cstheme="minorHAnsi"/>
           <w:lang w:val="en-US"/>
         </w:rPr>
-        <w:t>Component Diagram</w:t>
-      </w:r>
-      <w:bookmarkEnd w:id="27"/>
-      <w:bookmarkEnd w:id="28"/>
+      </w:r>
     </w:p>
     <w:p>
       <w:pPr>
         <w:pStyle w:val="Normal"/>
-        <w:spacing w:lineRule="auto" w:line="240" w:before="0" w:after="0"/>
-        <w:ind w:hanging="357" w:start="357"/>
-        <w:jc w:val="start"/>
-        <w:rPr>
-          <w:rFonts w:eastAsia="Times New Roman" w:cs="" w:cstheme="minorBidi"/>
-          <w:b/>
-          <w:bCs/>
-          <w:sz w:val="28"/>
-          <w:szCs w:val="28"/>
-          <w:lang w:val="en-US"/>
-        </w:rPr>
-      </w:pPr>
-      <w:r>
-        <w:rPr>
-          <w:rFonts w:eastAsia="Times New Roman" w:cs="" w:cstheme="minorBidi"/>
-          <w:b/>
-          <w:bCs/>
-          <w:sz w:val="28"/>
-          <w:szCs w:val="28"/>
-          <w:lang w:val="en-US"/>
-        </w:rPr>
-      </w:r>
-      <w:r>
-        <w:br w:type="page"/>
-      </w:r>
-    </w:p>
-    <w:p>
-      <w:pPr>
-        <w:pStyle w:val="Heading1"/>
         <w:spacing w:before="0" w:after="120"/>
-        <w:rPr>
-          <w:lang w:val="en-US"/>
-        </w:rPr>
-      </w:pPr>
-      <w:bookmarkStart w:id="29" w:name="_Toc242430098"/>
-      <w:r>
-        <w:rPr>
-          <w:lang w:val="en-US"/>
-        </w:rPr>
-        <w:t>Impl</w:t>
-      </w:r>
-      <w:r>
-        <w:rPr/>
-        <w:t>ementation</w:t>
-      </w:r>
-      <w:bookmarkEnd w:id="29"/>
-    </w:p>
-    <w:p>
-      <w:pPr>
-        <w:pStyle w:val="US2Kapitel"/>
-        <w:numPr>
-          <w:ilvl w:val="1"/>
-          <w:numId w:val="1"/>
-        </w:numPr>
         <w:rPr>
           <w:rFonts w:ascii="Calibri" w:hAnsi="Calibri" w:cs="Calibri" w:asciiTheme="minorHAnsi" w:cstheme="minorHAnsi" w:hAnsiTheme="minorHAnsi"/>
           <w:lang w:val="en-US"/>
         </w:rPr>
       </w:pPr>
-      <w:bookmarkStart w:id="30" w:name="_Toc242430099"/>
-      <w:bookmarkStart w:id="31" w:name="_Toc75855932"/>
       <w:r>
         <w:rPr>
           <w:rFonts w:cs="Calibri" w:cstheme="minorHAnsi"/>
           <w:lang w:val="en-US"/>
         </w:rPr>
-        <w:t>Class Diagrams</w:t>
-      </w:r>
-      <w:bookmarkEnd w:id="30"/>
-      <w:bookmarkEnd w:id="31"/>
-    </w:p>
-    <w:p>
-      <w:pPr>
-        <w:pStyle w:val="US2Kapitel"/>
-        <w:numPr>
-          <w:ilvl w:val="1"/>
-          <w:numId w:val="1"/>
-        </w:numPr>
-        <w:rPr>
-          <w:rFonts w:ascii="Calibri" w:hAnsi="Calibri" w:cs="Calibri" w:asciiTheme="minorHAnsi" w:cstheme="minorHAnsi" w:hAnsiTheme="minorHAnsi"/>
-          <w:lang w:val="en-US"/>
-        </w:rPr>
-      </w:pPr>
-      <w:bookmarkStart w:id="32" w:name="_Toc242430100"/>
-      <w:bookmarkStart w:id="33" w:name="_Toc75855933"/>
-      <w:r>
-        <w:rPr>
-          <w:rFonts w:cs="Calibri" w:cstheme="minorHAnsi"/>
-          <w:lang w:val="en-US"/>
-        </w:rPr>
-        <w:t>Sequence Diagrams</w:t>
-      </w:r>
-      <w:bookmarkEnd w:id="32"/>
-      <w:bookmarkEnd w:id="33"/>
-    </w:p>
-    <w:p>
-      <w:pPr>
-        <w:pStyle w:val="Normal"/>
-        <w:spacing w:lineRule="auto" w:line="240" w:before="0" w:after="0"/>
-        <w:ind w:hanging="357" w:start="357"/>
-        <w:jc w:val="start"/>
-        <w:rPr>
-          <w:rFonts w:ascii="Calibri" w:hAnsi="Calibri" w:eastAsia="Times New Roman" w:cs="Calibri" w:asciiTheme="minorHAnsi" w:cstheme="minorHAnsi" w:hAnsiTheme="minorHAnsi"/>
-          <w:b/>
-          <w:bCs/>
-          <w:sz w:val="28"/>
-          <w:szCs w:val="28"/>
-          <w:lang w:val="en-US"/>
-        </w:rPr>
-      </w:pPr>
-      <w:r>
-        <w:rPr>
-          <w:rFonts w:eastAsia="Times New Roman" w:cs="Calibri" w:cstheme="minorHAnsi"/>
-          <w:b/>
-          <w:bCs/>
-          <w:sz w:val="28"/>
-          <w:szCs w:val="28"/>
-          <w:lang w:val="en-US"/>
-        </w:rPr>
-      </w:r>
-      <w:r>
-        <w:br w:type="page"/>
-      </w:r>
-    </w:p>
-    <w:p>
-      <w:pPr>
-        <w:pStyle w:val="Heading1"/>
-        <w:spacing w:before="0" w:after="120"/>
-        <w:rPr>
-          <w:rFonts w:ascii="Calibri" w:hAnsi="Calibri" w:cs="Calibri" w:asciiTheme="minorHAnsi" w:cstheme="minorHAnsi" w:hAnsiTheme="minorHAnsi"/>
-          <w:lang w:val="en-US"/>
-        </w:rPr>
-      </w:pPr>
-      <w:bookmarkStart w:id="34" w:name="_Toc242430101"/>
-      <w:r>
-        <w:rPr>
-          <w:rFonts w:cs="Calibri" w:cstheme="minorHAnsi"/>
-          <w:lang w:val="en-US"/>
-        </w:rPr>
-        <w:t>Conclusion</w:t>
-      </w:r>
-      <w:bookmarkEnd w:id="34"/>
-    </w:p>
-    <w:p>
-      <w:pPr>
-        <w:pStyle w:val="Normal"/>
-        <w:rPr>
-          <w:rFonts w:ascii="Calibri" w:hAnsi="Calibri" w:cs="Calibri" w:asciiTheme="minorHAnsi" w:cstheme="minorHAnsi" w:hAnsiTheme="minorHAnsi"/>
-          <w:lang w:val="en-US"/>
-        </w:rPr>
-      </w:pPr>
-      <w:r>
-        <w:rPr>
-          <w:rFonts w:cs="Calibri" w:cstheme="minorHAnsi"/>
-          <w:lang w:val="en-US"/>
-        </w:rPr>
-      </w:r>
-    </w:p>
-    <w:p>
-      <w:pPr>
-        <w:pStyle w:val="Normal"/>
-        <w:spacing w:before="0" w:after="120"/>
-        <w:rPr>
-          <w:rFonts w:ascii="Calibri" w:hAnsi="Calibri" w:cs="Calibri" w:asciiTheme="minorHAnsi" w:cstheme="minorHAnsi" w:hAnsiTheme="minorHAnsi"/>
-          <w:lang w:val="en-US"/>
-        </w:rPr>
-      </w:pPr>
-      <w:r>
-        <w:rPr>
-          <w:rFonts w:cs="Calibri" w:cstheme="minorHAnsi"/>
-          <w:lang w:val="en-US"/>
-        </w:rPr>
       </w:r>
     </w:p>
     <w:sectPr>
-      <w:headerReference w:type="even" r:id="rId9"/>
-      <w:headerReference w:type="default" r:id="rId10"/>
-      <w:headerReference w:type="first" r:id="rId11"/>
+      <w:headerReference w:type="even" r:id="rId10"/>
+      <w:headerReference w:type="default" r:id="rId11"/>
+      <w:headerReference w:type="first" r:id="rId12"/>
       <w:type w:val="nextPage"/>
       <w:pgSz w:w="11906" w:h="16838"/>
       <w:pgMar w:left="1418" w:right="1418" w:gutter="284" w:header="851" w:top="1418" w:footer="0" w:bottom="1134"/>
@@ -4587,14 +4907,14 @@
       <w:tblLook w:val="04a0" w:firstRow="1" w:noVBand="1" w:lastRow="0" w:firstColumn="1" w:lastColumn="0" w:noHBand="0"/>
     </w:tblPr>
     <w:tblGrid>
-      <w:gridCol w:w="7927"/>
-      <w:gridCol w:w="859"/>
+      <w:gridCol w:w="7926"/>
+      <w:gridCol w:w="860"/>
     </w:tblGrid>
     <w:tr>
       <w:trPr/>
       <w:tc>
         <w:tcPr>
-          <w:tcW w:w="7927" w:type="dxa"/>
+          <w:tcW w:w="7926" w:type="dxa"/>
           <w:tcBorders>
             <w:bottom w:val="single" w:sz="4" w:space="0" w:color="000000"/>
           </w:tcBorders>
@@ -4613,7 +4933,7 @@
       </w:tc>
       <w:tc>
         <w:tcPr>
-          <w:tcW w:w="859" w:type="dxa"/>
+          <w:tcW w:w="860" w:type="dxa"/>
           <w:tcBorders>
             <w:bottom w:val="single" w:sz="4" w:space="0" w:color="000000"/>
           </w:tcBorders>
@@ -4679,14 +4999,14 @@
       <w:tblLook w:val="04a0" w:firstRow="1" w:noVBand="1" w:lastRow="0" w:firstColumn="1" w:lastColumn="0" w:noHBand="0"/>
     </w:tblPr>
     <w:tblGrid>
-      <w:gridCol w:w="7927"/>
-      <w:gridCol w:w="859"/>
+      <w:gridCol w:w="7926"/>
+      <w:gridCol w:w="860"/>
     </w:tblGrid>
     <w:tr>
       <w:trPr/>
       <w:tc>
         <w:tcPr>
-          <w:tcW w:w="7927" w:type="dxa"/>
+          <w:tcW w:w="7926" w:type="dxa"/>
           <w:tcBorders>
             <w:bottom w:val="single" w:sz="4" w:space="0" w:color="000000"/>
           </w:tcBorders>
@@ -4705,7 +5025,7 @@
       </w:tc>
       <w:tc>
         <w:tcPr>
-          <w:tcW w:w="859" w:type="dxa"/>
+          <w:tcW w:w="860" w:type="dxa"/>
           <w:tcBorders>
             <w:bottom w:val="single" w:sz="4" w:space="0" w:color="000000"/>
           </w:tcBorders>
@@ -4853,7 +5173,7 @@
             <w:rPr>
               <w:sz w:val="20"/>
             </w:rPr>
-            <w:t>8</w:t>
+            <w:t>9</w:t>
           </w:r>
           <w:r>
             <w:rPr>
@@ -4962,7 +5282,7 @@
             <w:rPr>
               <w:sz w:val="20"/>
             </w:rPr>
-            <w:t>8</w:t>
+            <w:t>9</w:t>
           </w:r>
           <w:r>
             <w:rPr>
@@ -6084,6 +6404,7 @@
     <w:rsid w:val="007d26ec"/>
     <w:pPr>
       <w:widowControl/>
+      <w:suppressAutoHyphens w:val="true"/>
       <w:bidi w:val="0"/>
       <w:spacing w:lineRule="auto" w:line="360" w:before="0" w:after="120"/>
       <w:ind w:hanging="0" w:start="0"/>
@@ -6768,6 +7089,11 @@
       <w:sz w:val="24"/>
     </w:rPr>
   </w:style>
+  <w:style w:type="character" w:styleId="Enlacedelndiceuser">
+    <w:name w:val="Enlace del índice (user)"/>
+    <w:qFormat/>
+    <w:rPr/>
+  </w:style>
   <w:style w:type="character" w:styleId="Enlacedelndice">
     <w:name w:val="Enlace del índice"/>
     <w:qFormat/>
@@ -6833,6 +7159,32 @@
       <w:rFonts w:cs="Arial"/>
     </w:rPr>
   </w:style>
+  <w:style w:type="paragraph" w:styleId="Ttulouser">
+    <w:name w:val="Título (user)"/>
+    <w:basedOn w:val="Normal"/>
+    <w:next w:val="BodyText"/>
+    <w:qFormat/>
+    <w:pPr>
+      <w:keepNext w:val="true"/>
+      <w:spacing w:before="240" w:after="120"/>
+    </w:pPr>
+    <w:rPr>
+      <w:rFonts w:ascii="Liberation Sans" w:hAnsi="Liberation Sans" w:eastAsia="Microsoft YaHei" w:cs="Arial"/>
+      <w:sz w:val="28"/>
+      <w:szCs w:val="28"/>
+    </w:rPr>
+  </w:style>
+  <w:style w:type="paragraph" w:styleId="ndiceuser">
+    <w:name w:val="Índice (user)"/>
+    <w:basedOn w:val="Normal"/>
+    <w:qFormat/>
+    <w:pPr>
+      <w:suppressLineNumbers/>
+    </w:pPr>
+    <w:rPr>
+      <w:rFonts w:cs="Arial"/>
+    </w:rPr>
+  </w:style>
   <w:style w:type="paragraph" w:styleId="NoSpacing">
     <w:name w:val="No Spacing"/>
     <w:uiPriority w:val="1"/>
@@ -6840,6 +7192,7 @@
     <w:rsid w:val="00603701"/>
     <w:pPr>
       <w:widowControl/>
+      <w:suppressAutoHyphens w:val="true"/>
       <w:bidi w:val="0"/>
       <w:spacing w:before="0" w:after="0"/>
       <w:ind w:hanging="0" w:start="0"/>
@@ -6990,6 +7343,13 @@
       <w:b/>
     </w:rPr>
   </w:style>
+  <w:style w:type="paragraph" w:styleId="Cabeceraypieuser">
+    <w:name w:val="Cabecera y pie (user)"/>
+    <w:basedOn w:val="Normal"/>
+    <w:qFormat/>
+    <w:pPr/>
+    <w:rPr/>
+  </w:style>
   <w:style w:type="paragraph" w:styleId="Cabeceraypie">
     <w:name w:val="Cabecera y pie"/>
     <w:basedOn w:val="Normal"/>
@@ -7064,6 +7424,7 @@
     <w:rsid w:val="00343efc"/>
     <w:pPr>
       <w:widowControl/>
+      <w:suppressAutoHyphens w:val="true"/>
       <w:bidi w:val="0"/>
       <w:spacing w:lineRule="auto" w:line="360" w:before="0" w:after="120"/>
       <w:ind w:hanging="0" w:start="0"/>
@@ -7234,7 +7595,7 @@
   </w:style>
   <w:style w:type="paragraph" w:styleId="IndexHeading">
     <w:name w:val="index heading"/>
-    <w:basedOn w:val="Ttulo"/>
+    <w:basedOn w:val="Ttulouser"/>
     <w:pPr/>
     <w:rPr/>
   </w:style>
@@ -7304,42 +7665,65 @@
   </w:style>
   <w:style w:type="paragraph" w:styleId="TOC4">
     <w:name w:val="toc 4"/>
-    <w:basedOn w:val="ndice"/>
+    <w:basedOn w:val="ndiceuser"/>
     <w:pPr/>
     <w:rPr/>
   </w:style>
   <w:style w:type="paragraph" w:styleId="TOC5">
     <w:name w:val="toc 5"/>
-    <w:basedOn w:val="ndice"/>
+    <w:basedOn w:val="ndiceuser"/>
     <w:pPr/>
     <w:rPr/>
   </w:style>
   <w:style w:type="paragraph" w:styleId="TOC6">
     <w:name w:val="toc 6"/>
-    <w:basedOn w:val="ndice"/>
+    <w:basedOn w:val="ndiceuser"/>
     <w:pPr/>
     <w:rPr/>
   </w:style>
   <w:style w:type="paragraph" w:styleId="TOC7">
     <w:name w:val="toc 7"/>
-    <w:basedOn w:val="ndice"/>
+    <w:basedOn w:val="ndiceuser"/>
     <w:pPr/>
     <w:rPr/>
   </w:style>
   <w:style w:type="paragraph" w:styleId="TOC8">
     <w:name w:val="toc 8"/>
-    <w:basedOn w:val="ndice"/>
+    <w:basedOn w:val="ndiceuser"/>
     <w:pPr/>
     <w:rPr/>
   </w:style>
   <w:style w:type="paragraph" w:styleId="TOC9">
     <w:name w:val="toc 9"/>
-    <w:basedOn w:val="ndice"/>
+    <w:basedOn w:val="ndiceuser"/>
     <w:pPr/>
     <w:rPr/>
   </w:style>
-  <w:style w:type="numbering" w:styleId="Ningunalista" w:default="1">
-    <w:name w:val="Ninguna lista"/>
+  <w:style w:type="paragraph" w:styleId="Contenidodelatabla">
+    <w:name w:val="Contenido de la tabla"/>
+    <w:basedOn w:val="Normal"/>
+    <w:qFormat/>
+    <w:pPr>
+      <w:widowControl w:val="false"/>
+      <w:suppressLineNumbers/>
+    </w:pPr>
+    <w:rPr/>
+  </w:style>
+  <w:style w:type="paragraph" w:styleId="Ttulodelatabla">
+    <w:name w:val="Título de la tabla"/>
+    <w:basedOn w:val="Contenidodelatabla"/>
+    <w:qFormat/>
+    <w:pPr>
+      <w:suppressLineNumbers/>
+      <w:jc w:val="center"/>
+    </w:pPr>
+    <w:rPr>
+      <w:b/>
+      <w:bCs/>
+    </w:rPr>
+  </w:style>
+  <w:style w:type="numbering" w:styleId="Ningunalistauser" w:default="1">
+    <w:name w:val="Ninguna lista (user)"/>
     <w:uiPriority w:val="99"/>
     <w:semiHidden/>
     <w:unhideWhenUsed/>

</xml_diff>

<commit_message>
Added general diagram use-cases
</commit_message>
<xml_diff>
--- a/TurboTicketTornado/SWD-Project-Template.docx
+++ b/TurboTicketTornado/SWD-Project-Template.docx
@@ -2352,8 +2352,8 @@
           <w:rFonts w:ascii="Calibri" w:hAnsi="Calibri" w:cs="Calibri" w:asciiTheme="minorHAnsi" w:cstheme="minorHAnsi" w:hAnsiTheme="minorHAnsi"/>
         </w:rPr>
       </w:pPr>
-      <w:bookmarkStart w:id="2" w:name="_Toc75855924"/>
-      <w:bookmarkStart w:id="3" w:name="_Toc242430078"/>
+      <w:bookmarkStart w:id="2" w:name="_Toc242430078"/>
+      <w:bookmarkStart w:id="3" w:name="_Toc75855924"/>
       <w:r>
         <w:rPr>
           <w:rFonts w:cs="Calibri" w:cstheme="minorHAnsi"/>
@@ -3517,8 +3517,8 @@
           <w:rFonts w:ascii="Calibri" w:hAnsi="Calibri" w:cs="Calibri" w:asciiTheme="minorHAnsi" w:cstheme="minorHAnsi" w:hAnsiTheme="minorHAnsi"/>
         </w:rPr>
       </w:pPr>
-      <w:bookmarkStart w:id="8" w:name="_Toc75855925"/>
-      <w:bookmarkStart w:id="9" w:name="_Toc242430083"/>
+      <w:bookmarkStart w:id="8" w:name="_Toc242430083"/>
+      <w:bookmarkStart w:id="9" w:name="_Toc75855925"/>
       <w:r>
         <w:rPr>
           <w:rFonts w:cs="Calibri" w:cstheme="minorHAnsi"/>
@@ -3539,8 +3539,8 @@
           <w:rFonts w:ascii="Calibri" w:hAnsi="Calibri" w:cs="Calibri" w:asciiTheme="minorHAnsi" w:cstheme="minorHAnsi" w:hAnsiTheme="minorHAnsi"/>
         </w:rPr>
       </w:pPr>
-      <w:bookmarkStart w:id="10" w:name="_Toc75855926"/>
-      <w:bookmarkStart w:id="11" w:name="_Toc242430084"/>
+      <w:bookmarkStart w:id="10" w:name="_Toc242430084"/>
+      <w:bookmarkStart w:id="11" w:name="_Toc75855926"/>
       <w:r>
         <w:rPr>
           <w:rFonts w:cs="Calibri" w:cstheme="minorHAnsi"/>
@@ -4053,8 +4053,8 @@
           <w:rFonts w:ascii="Calibri" w:hAnsi="Calibri" w:cs="Calibri" w:asciiTheme="minorHAnsi" w:cstheme="minorHAnsi" w:hAnsiTheme="minorHAnsi"/>
         </w:rPr>
       </w:pPr>
-      <w:bookmarkStart w:id="16" w:name="_Toc75855927"/>
-      <w:bookmarkStart w:id="17" w:name="_Toc242430089"/>
+      <w:bookmarkStart w:id="16" w:name="_Toc242430089"/>
+      <w:bookmarkStart w:id="17" w:name="_Toc75855927"/>
       <w:r>
         <w:rPr>
           <w:rFonts w:cs="Calibri" w:cstheme="minorHAnsi"/>
@@ -4063,6 +4063,71 @@
       </w:r>
       <w:bookmarkEnd w:id="16"/>
       <w:bookmarkEnd w:id="17"/>
+    </w:p>
+    <w:p>
+      <w:pPr>
+        <w:pStyle w:val="US2Kapitel"/>
+        <w:numPr>
+          <w:ilvl w:val="0"/>
+          <w:numId w:val="0"/>
+        </w:numPr>
+        <w:ind w:hanging="0" w:start="576"/>
+        <w:rPr>
+          <w:rFonts w:ascii="Calibri" w:hAnsi="Calibri" w:cs="Calibri" w:asciiTheme="minorHAnsi" w:cstheme="minorHAnsi" w:hAnsiTheme="minorHAnsi"/>
+        </w:rPr>
+      </w:pPr>
+      <w:r>
+        <w:rPr>
+          <w:rFonts w:cs="Calibri" w:cstheme="minorHAnsi"/>
+        </w:rPr>
+        <w:drawing>
+          <wp:anchor distT="0" distB="0" distL="0" distR="0" simplePos="0" relativeHeight="4" behindDoc="0" locked="0" layoutInCell="0" allowOverlap="1">
+            <wp:simplePos x="0" y="0"/>
+            <wp:positionH relativeFrom="column">
+              <wp:posOffset>0</wp:posOffset>
+            </wp:positionH>
+            <wp:positionV relativeFrom="paragraph">
+              <wp:posOffset>-10795</wp:posOffset>
+            </wp:positionV>
+            <wp:extent cx="5579110" cy="3756660"/>
+            <wp:effectExtent l="0" t="0" r="0" b="0"/>
+            <wp:wrapSquare wrapText="largest"/>
+            <wp:docPr id="2" name="Imagen2"/>
+            <wp:cNvGraphicFramePr>
+              <a:graphicFrameLocks xmlns:a="http://schemas.openxmlformats.org/drawingml/2006/main" noChangeAspect="1"/>
+            </wp:cNvGraphicFramePr>
+            <a:graphic xmlns:a="http://schemas.openxmlformats.org/drawingml/2006/main">
+              <a:graphicData uri="http://schemas.openxmlformats.org/drawingml/2006/picture">
+                <pic:pic xmlns:pic="http://schemas.openxmlformats.org/drawingml/2006/picture">
+                  <pic:nvPicPr>
+                    <pic:cNvPr id="2" name="Imagen2"/>
+                    <pic:cNvPicPr>
+                      <a:picLocks noChangeAspect="1" noChangeArrowheads="1"/>
+                    </pic:cNvPicPr>
+                  </pic:nvPicPr>
+                  <pic:blipFill>
+                    <a:blip r:embed="rId9"/>
+                    <a:srcRect l="0" t="2073" r="0" b="0"/>
+                    <a:stretch>
+                      <a:fillRect/>
+                    </a:stretch>
+                  </pic:blipFill>
+                  <pic:spPr bwMode="auto">
+                    <a:xfrm>
+                      <a:off x="0" y="0"/>
+                      <a:ext cx="5579110" cy="3756660"/>
+                    </a:xfrm>
+                    <a:prstGeom prst="rect">
+                      <a:avLst/>
+                    </a:prstGeom>
+                    <a:noFill/>
+                  </pic:spPr>
+                </pic:pic>
+              </a:graphicData>
+            </a:graphic>
+          </wp:anchor>
+        </w:drawing>
+      </w:r>
     </w:p>
     <w:p>
       <w:pPr>
@@ -4075,8 +4140,8 @@
           <w:rFonts w:ascii="Calibri" w:hAnsi="Calibri" w:cs="Calibri" w:asciiTheme="minorHAnsi" w:cstheme="minorHAnsi" w:hAnsiTheme="minorHAnsi"/>
         </w:rPr>
       </w:pPr>
-      <w:bookmarkStart w:id="18" w:name="_Toc75855928"/>
-      <w:bookmarkStart w:id="19" w:name="_Toc242430090"/>
+      <w:bookmarkStart w:id="18" w:name="_Toc242430090"/>
+      <w:bookmarkStart w:id="19" w:name="_Toc75855928"/>
       <w:r>
         <w:rPr>
           <w:rFonts w:cs="Calibri" w:cstheme="minorHAnsi"/>
@@ -4142,8 +4207,8 @@
           <w:rFonts w:ascii="Calibri" w:hAnsi="Calibri" w:cs="Calibri" w:asciiTheme="minorHAnsi" w:cstheme="minorHAnsi" w:hAnsiTheme="minorHAnsi"/>
         </w:rPr>
       </w:pPr>
-      <w:bookmarkStart w:id="22" w:name="_Toc75855929"/>
-      <w:bookmarkStart w:id="23" w:name="_Toc242430093"/>
+      <w:bookmarkStart w:id="22" w:name="_Toc242430093"/>
+      <w:bookmarkStart w:id="23" w:name="_Toc75855929"/>
       <w:r>
         <w:rPr>
           <w:rFonts w:cs="Calibri" w:cstheme="minorHAnsi"/>
@@ -4209,25 +4274,13 @@
           <w:rFonts w:ascii="Calibri" w:hAnsi="Calibri" w:cs="Calibri" w:asciiTheme="minorHAnsi" w:cstheme="minorHAnsi" w:hAnsiTheme="minorHAnsi"/>
         </w:rPr>
       </w:pPr>
-      <w:bookmarkStart w:id="26" w:name="_Toc75855929_Copia_1"/>
-      <w:bookmarkStart w:id="27" w:name="_Toc242430093_Copia_1"/>
+      <w:bookmarkStart w:id="26" w:name="_Toc242430093_Copia_1"/>
+      <w:bookmarkStart w:id="27" w:name="_Toc75855929_Copia_1"/>
       <w:r>
         <w:rPr>
           <w:rFonts w:cs="Calibri" w:cstheme="minorHAnsi"/>
         </w:rPr>
-        <w:t xml:space="preserve">Use Case </w:t>
-      </w:r>
-      <w:r>
-        <w:rPr>
-          <w:rFonts w:cs="Calibri" w:cstheme="minorHAnsi"/>
-        </w:rPr>
-        <w:t>3</w:t>
-      </w:r>
-      <w:r>
-        <w:rPr>
-          <w:rFonts w:cs="Calibri" w:cstheme="minorHAnsi"/>
-        </w:rPr>
-        <w:t xml:space="preserve"> </w:t>
+        <w:t xml:space="preserve">Use Case 3 </w:t>
       </w:r>
       <w:bookmarkEnd w:id="26"/>
       <w:bookmarkEnd w:id="27"/>
@@ -4295,7 +4348,7 @@
           </w:tcPr>
           <w:p>
             <w:pPr>
-              <w:pStyle w:val="Contenidodelatabla"/>
+              <w:pStyle w:val="Contenidodelatablauser"/>
               <w:widowControl w:val="false"/>
               <w:suppressLineNumbers/>
               <w:spacing w:before="0" w:after="120"/>
@@ -4304,7 +4357,6 @@
             <w:r>
               <w:rPr>
                 <w:rStyle w:val="Strong"/>
-                <w:rFonts w:ascii="Calibri" w:hAnsi="Calibri"/>
               </w:rPr>
               <w:t>Trigger</w:t>
             </w:r>
@@ -4318,16 +4370,14 @@
           </w:tcPr>
           <w:p>
             <w:pPr>
-              <w:pStyle w:val="Contenidodelatabla"/>
+              <w:pStyle w:val="Contenidodelatablauser"/>
               <w:spacing w:lineRule="auto" w:line="276" w:before="0" w:after="120"/>
               <w:rPr>
                 <w:rFonts w:ascii="Calibri" w:hAnsi="Calibri"/>
               </w:rPr>
             </w:pPr>
             <w:r>
-              <w:rPr>
-                <w:rFonts w:ascii="Calibri" w:hAnsi="Calibri"/>
-              </w:rPr>
+              <w:rPr/>
               <w:t>The customer selects “Buy season ticket” in a client (web, app, kiosk or POS).</w:t>
             </w:r>
           </w:p>
@@ -4345,7 +4395,7 @@
           </w:tcPr>
           <w:p>
             <w:pPr>
-              <w:pStyle w:val="Contenidodelatabla"/>
+              <w:pStyle w:val="Contenidodelatablauser"/>
               <w:widowControl w:val="false"/>
               <w:suppressLineNumbers/>
               <w:spacing w:before="0" w:after="120"/>
@@ -4354,7 +4404,6 @@
             <w:r>
               <w:rPr>
                 <w:rStyle w:val="Strong"/>
-                <w:rFonts w:ascii="Calibri" w:hAnsi="Calibri"/>
               </w:rPr>
               <w:t>Pre-conditions</w:t>
             </w:r>
@@ -4368,16 +4417,14 @@
           </w:tcPr>
           <w:p>
             <w:pPr>
-              <w:pStyle w:val="Contenidodelatabla"/>
+              <w:pStyle w:val="Contenidodelatablauser"/>
               <w:spacing w:lineRule="auto" w:line="276" w:before="0" w:after="120"/>
               <w:rPr>
                 <w:rFonts w:ascii="Calibri" w:hAnsi="Calibri"/>
               </w:rPr>
             </w:pPr>
             <w:r>
-              <w:rPr>
-                <w:rFonts w:ascii="Calibri" w:hAnsi="Calibri"/>
-              </w:rPr>
+              <w:rPr/>
               <w:t>1. The customer has a registered account and is logged in. 2. The customer has exactly one customer type assigned (regular, reduced-price, fan club member). 3. At least one competition/series with home matches is open for season ticket sales. 4. Stadium sectors, seats and prices per sector and competition type are defined in the system.</w:t>
             </w:r>
           </w:p>
@@ -4395,7 +4442,7 @@
           </w:tcPr>
           <w:p>
             <w:pPr>
-              <w:pStyle w:val="Contenidodelatabla"/>
+              <w:pStyle w:val="Contenidodelatablauser"/>
               <w:spacing w:before="0" w:after="120"/>
               <w:rPr>
                 <w:rFonts w:ascii="Calibri" w:hAnsi="Calibri"/>
@@ -4405,7 +4452,6 @@
             </w:pPr>
             <w:r>
               <w:rPr>
-                <w:rFonts w:ascii="Calibri" w:hAnsi="Calibri"/>
                 <w:b/>
                 <w:bCs/>
               </w:rPr>
@@ -4421,16 +4467,14 @@
           </w:tcPr>
           <w:p>
             <w:pPr>
-              <w:pStyle w:val="Contenidodelatabla"/>
+              <w:pStyle w:val="Contenidodelatablauser"/>
               <w:spacing w:lineRule="auto" w:line="276" w:before="0" w:after="120"/>
               <w:rPr>
                 <w:rFonts w:ascii="Calibri" w:hAnsi="Calibri"/>
               </w:rPr>
             </w:pPr>
             <w:r>
-              <w:rPr>
-                <w:rFonts w:ascii="Calibri" w:hAnsi="Calibri"/>
-              </w:rPr>
+              <w:rPr/>
               <w:t xml:space="preserve">A season ticket exists, linked to the customer, the seat and the competition/series. The seat is shown as sold for every match of that competition, both for season and single-match sales. The payment is registered. </w:t>
             </w:r>
           </w:p>
@@ -4460,7 +4504,7 @@
       <w:bookmarkStart w:id="29" w:name="_Toc242430095_Copia_1"/>
       <w:r>
         <w:rPr>
-          <w:rFonts w:cstheme="minorHAnsi"/>
+          <w:rFonts w:cs="Calibri" w:cstheme="minorHAnsi"/>
         </w:rPr>
         <w:t>Activity Diagram</w:t>
       </w:r>
@@ -4475,7 +4519,7 @@
       </w:pPr>
       <w:r>
         <w:rPr>
-          <w:rFonts w:cstheme="minorHAnsi"/>
+          <w:rFonts w:cs="Calibri" w:cstheme="minorHAnsi"/>
         </w:rPr>
         <w:drawing>
           <wp:anchor distT="0" distB="0" distL="0" distR="0" simplePos="0" relativeHeight="3" behindDoc="0" locked="0" layoutInCell="0" allowOverlap="1">
@@ -4489,7 +4533,7 @@
             <wp:extent cx="5382895" cy="2962275"/>
             <wp:effectExtent l="0" t="0" r="0" b="0"/>
             <wp:wrapSquare wrapText="largest"/>
-            <wp:docPr id="2" name="Imagen1"/>
+            <wp:docPr id="3" name="Imagen1"/>
             <wp:cNvGraphicFramePr>
               <a:graphicFrameLocks xmlns:a="http://schemas.openxmlformats.org/drawingml/2006/main" noChangeAspect="1"/>
             </wp:cNvGraphicFramePr>
@@ -4497,13 +4541,13 @@
               <a:graphicData uri="http://schemas.openxmlformats.org/drawingml/2006/picture">
                 <pic:pic xmlns:pic="http://schemas.openxmlformats.org/drawingml/2006/picture">
                   <pic:nvPicPr>
-                    <pic:cNvPr id="2" name="Imagen1"/>
+                    <pic:cNvPr id="3" name="Imagen1"/>
                     <pic:cNvPicPr>
                       <a:picLocks noChangeAspect="1" noChangeArrowheads="1"/>
                     </pic:cNvPicPr>
                   </pic:nvPicPr>
                   <pic:blipFill>
-                    <a:blip r:embed="rId9"/>
+                    <a:blip r:embed="rId10"/>
                     <a:srcRect l="0" t="4877" r="3517" b="6443"/>
                     <a:stretch>
                       <a:fillRect/>
@@ -4560,8 +4604,8 @@
           <w:lang w:val="en-US"/>
         </w:rPr>
       </w:pPr>
-      <w:bookmarkStart w:id="31" w:name="_Toc75855931"/>
-      <w:bookmarkStart w:id="32" w:name="_Toc242430097"/>
+      <w:bookmarkStart w:id="31" w:name="_Toc242430097"/>
+      <w:bookmarkStart w:id="32" w:name="_Toc75855931"/>
       <w:r>
         <w:rPr>
           <w:rFonts w:cs="Calibri" w:cstheme="minorHAnsi"/>
@@ -4634,8 +4678,8 @@
           <w:lang w:val="en-US"/>
         </w:rPr>
       </w:pPr>
-      <w:bookmarkStart w:id="34" w:name="_Toc75855932"/>
-      <w:bookmarkStart w:id="35" w:name="_Toc242430099"/>
+      <w:bookmarkStart w:id="34" w:name="_Toc242430099"/>
+      <w:bookmarkStart w:id="35" w:name="_Toc75855932"/>
       <w:r>
         <w:rPr>
           <w:rFonts w:cs="Calibri" w:cstheme="minorHAnsi"/>
@@ -4658,8 +4702,8 @@
           <w:lang w:val="en-US"/>
         </w:rPr>
       </w:pPr>
-      <w:bookmarkStart w:id="36" w:name="_Toc75855933"/>
-      <w:bookmarkStart w:id="37" w:name="_Toc242430100"/>
+      <w:bookmarkStart w:id="36" w:name="_Toc242430100"/>
+      <w:bookmarkStart w:id="37" w:name="_Toc75855933"/>
       <w:r>
         <w:rPr>
           <w:rFonts w:cs="Calibri" w:cstheme="minorHAnsi"/>
@@ -4750,9 +4794,9 @@
       </w:r>
     </w:p>
     <w:sectPr>
-      <w:headerReference w:type="even" r:id="rId10"/>
-      <w:headerReference w:type="default" r:id="rId11"/>
-      <w:headerReference w:type="first" r:id="rId12"/>
+      <w:headerReference w:type="even" r:id="rId11"/>
+      <w:headerReference w:type="default" r:id="rId12"/>
+      <w:headerReference w:type="first" r:id="rId13"/>
       <w:type w:val="nextPage"/>
       <w:pgSz w:w="11906" w:h="16838"/>
       <w:pgMar w:left="1418" w:right="1418" w:gutter="284" w:header="851" w:top="1418" w:footer="0" w:bottom="1134"/>
@@ -4907,14 +4951,14 @@
       <w:tblLook w:val="04a0" w:firstRow="1" w:noVBand="1" w:lastRow="0" w:firstColumn="1" w:lastColumn="0" w:noHBand="0"/>
     </w:tblPr>
     <w:tblGrid>
-      <w:gridCol w:w="7926"/>
-      <w:gridCol w:w="860"/>
+      <w:gridCol w:w="7925"/>
+      <w:gridCol w:w="861"/>
     </w:tblGrid>
     <w:tr>
       <w:trPr/>
       <w:tc>
         <w:tcPr>
-          <w:tcW w:w="7926" w:type="dxa"/>
+          <w:tcW w:w="7925" w:type="dxa"/>
           <w:tcBorders>
             <w:bottom w:val="single" w:sz="4" w:space="0" w:color="000000"/>
           </w:tcBorders>
@@ -4933,7 +4977,7 @@
       </w:tc>
       <w:tc>
         <w:tcPr>
-          <w:tcW w:w="860" w:type="dxa"/>
+          <w:tcW w:w="861" w:type="dxa"/>
           <w:tcBorders>
             <w:bottom w:val="single" w:sz="4" w:space="0" w:color="000000"/>
           </w:tcBorders>
@@ -4999,14 +5043,14 @@
       <w:tblLook w:val="04a0" w:firstRow="1" w:noVBand="1" w:lastRow="0" w:firstColumn="1" w:lastColumn="0" w:noHBand="0"/>
     </w:tblPr>
     <w:tblGrid>
-      <w:gridCol w:w="7926"/>
-      <w:gridCol w:w="860"/>
+      <w:gridCol w:w="7925"/>
+      <w:gridCol w:w="861"/>
     </w:tblGrid>
     <w:tr>
       <w:trPr/>
       <w:tc>
         <w:tcPr>
-          <w:tcW w:w="7926" w:type="dxa"/>
+          <w:tcW w:w="7925" w:type="dxa"/>
           <w:tcBorders>
             <w:bottom w:val="single" w:sz="4" w:space="0" w:color="000000"/>
           </w:tcBorders>
@@ -5025,7 +5069,7 @@
       </w:tc>
       <w:tc>
         <w:tcPr>
-          <w:tcW w:w="860" w:type="dxa"/>
+          <w:tcW w:w="861" w:type="dxa"/>
           <w:tcBorders>
             <w:bottom w:val="single" w:sz="4" w:space="0" w:color="000000"/>
           </w:tcBorders>
@@ -7089,13 +7133,13 @@
       <w:sz w:val="24"/>
     </w:rPr>
   </w:style>
+  <w:style w:type="character" w:styleId="Enlacedelndice">
+    <w:name w:val="Enlace del índice"/>
+    <w:qFormat/>
+    <w:rPr/>
+  </w:style>
   <w:style w:type="character" w:styleId="Enlacedelndiceuser">
     <w:name w:val="Enlace del índice (user)"/>
-    <w:qFormat/>
-    <w:rPr/>
-  </w:style>
-  <w:style w:type="character" w:styleId="Enlacedelndice">
-    <w:name w:val="Enlace del índice"/>
     <w:qFormat/>
     <w:rPr/>
   </w:style>
@@ -7343,15 +7387,15 @@
       <w:b/>
     </w:rPr>
   </w:style>
-  <w:style w:type="paragraph" w:styleId="Cabeceraypieuser">
-    <w:name w:val="Cabecera y pie (user)"/>
+  <w:style w:type="paragraph" w:styleId="Cabeceraypie">
+    <w:name w:val="Cabecera y pie"/>
     <w:basedOn w:val="Normal"/>
     <w:qFormat/>
     <w:pPr/>
     <w:rPr/>
   </w:style>
-  <w:style w:type="paragraph" w:styleId="Cabeceraypie">
-    <w:name w:val="Cabecera y pie"/>
+  <w:style w:type="paragraph" w:styleId="Cabeceraypieuser">
+    <w:name w:val="Cabecera y pie (user)"/>
     <w:basedOn w:val="Normal"/>
     <w:qFormat/>
     <w:pPr/>
@@ -7595,7 +7639,7 @@
   </w:style>
   <w:style w:type="paragraph" w:styleId="IndexHeading">
     <w:name w:val="index heading"/>
-    <w:basedOn w:val="Ttulouser"/>
+    <w:basedOn w:val="Ttulo"/>
     <w:pPr/>
     <w:rPr/>
   </w:style>
@@ -7665,42 +7709,42 @@
   </w:style>
   <w:style w:type="paragraph" w:styleId="TOC4">
     <w:name w:val="toc 4"/>
-    <w:basedOn w:val="ndiceuser"/>
+    <w:basedOn w:val="ndice"/>
     <w:pPr/>
     <w:rPr/>
   </w:style>
   <w:style w:type="paragraph" w:styleId="TOC5">
     <w:name w:val="toc 5"/>
-    <w:basedOn w:val="ndiceuser"/>
+    <w:basedOn w:val="ndice"/>
     <w:pPr/>
     <w:rPr/>
   </w:style>
   <w:style w:type="paragraph" w:styleId="TOC6">
     <w:name w:val="toc 6"/>
-    <w:basedOn w:val="ndiceuser"/>
+    <w:basedOn w:val="ndice"/>
     <w:pPr/>
     <w:rPr/>
   </w:style>
   <w:style w:type="paragraph" w:styleId="TOC7">
     <w:name w:val="toc 7"/>
-    <w:basedOn w:val="ndiceuser"/>
+    <w:basedOn w:val="ndice"/>
     <w:pPr/>
     <w:rPr/>
   </w:style>
   <w:style w:type="paragraph" w:styleId="TOC8">
     <w:name w:val="toc 8"/>
-    <w:basedOn w:val="ndiceuser"/>
+    <w:basedOn w:val="ndice"/>
     <w:pPr/>
     <w:rPr/>
   </w:style>
   <w:style w:type="paragraph" w:styleId="TOC9">
     <w:name w:val="toc 9"/>
-    <w:basedOn w:val="ndiceuser"/>
+    <w:basedOn w:val="ndice"/>
     <w:pPr/>
     <w:rPr/>
   </w:style>
-  <w:style w:type="paragraph" w:styleId="Contenidodelatabla">
-    <w:name w:val="Contenido de la tabla"/>
+  <w:style w:type="paragraph" w:styleId="Contenidodelatablauser">
+    <w:name w:val="Contenido de la tabla (user)"/>
     <w:basedOn w:val="Normal"/>
     <w:qFormat/>
     <w:pPr>
@@ -7709,9 +7753,9 @@
     </w:pPr>
     <w:rPr/>
   </w:style>
-  <w:style w:type="paragraph" w:styleId="Ttulodelatabla">
-    <w:name w:val="Título de la tabla"/>
-    <w:basedOn w:val="Contenidodelatabla"/>
+  <w:style w:type="paragraph" w:styleId="Ttulodelatablauser">
+    <w:name w:val="Título de la tabla (user)"/>
+    <w:basedOn w:val="Contenidodelatablauser"/>
     <w:qFormat/>
     <w:pPr>
       <w:suppressLineNumbers/>
@@ -7722,8 +7766,8 @@
       <w:bCs/>
     </w:rPr>
   </w:style>
-  <w:style w:type="numbering" w:styleId="Ningunalistauser" w:default="1">
-    <w:name w:val="Ninguna lista (user)"/>
+  <w:style w:type="numbering" w:styleId="Ningunalista" w:default="1">
+    <w:name w:val="Ninguna lista"/>
     <w:uiPriority w:val="99"/>
     <w:semiHidden/>
     <w:unhideWhenUsed/>

</xml_diff>

<commit_message>
Updated General Diagram use-cases
</commit_message>
<xml_diff>
--- a/TurboTicketTornado/SWD-Project-Template.docx
+++ b/TurboTicketTornado/SWD-Project-Template.docx
@@ -2352,8 +2352,8 @@
           <w:rFonts w:ascii="Calibri" w:hAnsi="Calibri" w:cs="Calibri" w:asciiTheme="minorHAnsi" w:cstheme="minorHAnsi" w:hAnsiTheme="minorHAnsi"/>
         </w:rPr>
       </w:pPr>
-      <w:bookmarkStart w:id="2" w:name="_Toc242430078"/>
-      <w:bookmarkStart w:id="3" w:name="_Toc75855924"/>
+      <w:bookmarkStart w:id="2" w:name="_Toc75855924"/>
+      <w:bookmarkStart w:id="3" w:name="_Toc242430078"/>
       <w:r>
         <w:rPr>
           <w:rFonts w:cs="Calibri" w:cstheme="minorHAnsi"/>
@@ -3517,8 +3517,8 @@
           <w:rFonts w:ascii="Calibri" w:hAnsi="Calibri" w:cs="Calibri" w:asciiTheme="minorHAnsi" w:cstheme="minorHAnsi" w:hAnsiTheme="minorHAnsi"/>
         </w:rPr>
       </w:pPr>
-      <w:bookmarkStart w:id="8" w:name="_Toc242430083"/>
-      <w:bookmarkStart w:id="9" w:name="_Toc75855925"/>
+      <w:bookmarkStart w:id="8" w:name="_Toc75855925"/>
+      <w:bookmarkStart w:id="9" w:name="_Toc242430083"/>
       <w:r>
         <w:rPr>
           <w:rFonts w:cs="Calibri" w:cstheme="minorHAnsi"/>
@@ -3539,8 +3539,8 @@
           <w:rFonts w:ascii="Calibri" w:hAnsi="Calibri" w:cs="Calibri" w:asciiTheme="minorHAnsi" w:cstheme="minorHAnsi" w:hAnsiTheme="minorHAnsi"/>
         </w:rPr>
       </w:pPr>
-      <w:bookmarkStart w:id="10" w:name="_Toc242430084"/>
-      <w:bookmarkStart w:id="11" w:name="_Toc75855926"/>
+      <w:bookmarkStart w:id="10" w:name="_Toc75855926"/>
+      <w:bookmarkStart w:id="11" w:name="_Toc242430084"/>
       <w:r>
         <w:rPr>
           <w:rFonts w:cs="Calibri" w:cstheme="minorHAnsi"/>
@@ -4053,8 +4053,8 @@
           <w:rFonts w:ascii="Calibri" w:hAnsi="Calibri" w:cs="Calibri" w:asciiTheme="minorHAnsi" w:cstheme="minorHAnsi" w:hAnsiTheme="minorHAnsi"/>
         </w:rPr>
       </w:pPr>
-      <w:bookmarkStart w:id="16" w:name="_Toc242430089"/>
-      <w:bookmarkStart w:id="17" w:name="_Toc75855927"/>
+      <w:bookmarkStart w:id="16" w:name="_Toc75855927"/>
+      <w:bookmarkStart w:id="17" w:name="_Toc242430089"/>
       <w:r>
         <w:rPr>
           <w:rFonts w:cs="Calibri" w:cstheme="minorHAnsi"/>
@@ -4071,7 +4071,7 @@
           <w:ilvl w:val="0"/>
           <w:numId w:val="0"/>
         </w:numPr>
-        <w:ind w:hanging="0" w:start="576"/>
+        <w:ind w:hanging="0" w:start="0"/>
         <w:rPr>
           <w:rFonts w:ascii="Calibri" w:hAnsi="Calibri" w:cs="Calibri" w:asciiTheme="minorHAnsi" w:cstheme="minorHAnsi" w:hAnsiTheme="minorHAnsi"/>
         </w:rPr>
@@ -4084,14 +4084,14 @@
           <wp:anchor distT="0" distB="0" distL="0" distR="0" simplePos="0" relativeHeight="4" behindDoc="0" locked="0" layoutInCell="0" allowOverlap="1">
             <wp:simplePos x="0" y="0"/>
             <wp:positionH relativeFrom="column">
-              <wp:posOffset>0</wp:posOffset>
+              <wp:posOffset>82550</wp:posOffset>
             </wp:positionH>
             <wp:positionV relativeFrom="paragraph">
-              <wp:posOffset>-10795</wp:posOffset>
+              <wp:posOffset>64135</wp:posOffset>
             </wp:positionV>
-            <wp:extent cx="5579110" cy="3756660"/>
+            <wp:extent cx="5146675" cy="3469005"/>
             <wp:effectExtent l="0" t="0" r="0" b="0"/>
-            <wp:wrapSquare wrapText="largest"/>
+            <wp:wrapTopAndBottom/>
             <wp:docPr id="2" name="Imagen2"/>
             <wp:cNvGraphicFramePr>
               <a:graphicFrameLocks xmlns:a="http://schemas.openxmlformats.org/drawingml/2006/main" noChangeAspect="1"/>
@@ -4107,7 +4107,7 @@
                   </pic:nvPicPr>
                   <pic:blipFill>
                     <a:blip r:embed="rId9"/>
-                    <a:srcRect l="0" t="2073" r="0" b="0"/>
+                    <a:srcRect l="1272" t="1815" r="0" b="0"/>
                     <a:stretch>
                       <a:fillRect/>
                     </a:stretch>
@@ -4115,7 +4115,7 @@
                   <pic:spPr bwMode="auto">
                     <a:xfrm>
                       <a:off x="0" y="0"/>
-                      <a:ext cx="5579110" cy="3756660"/>
+                      <a:ext cx="5146675" cy="3469005"/>
                     </a:xfrm>
                     <a:prstGeom prst="rect">
                       <a:avLst/>
@@ -4140,8 +4140,8 @@
           <w:rFonts w:ascii="Calibri" w:hAnsi="Calibri" w:cs="Calibri" w:asciiTheme="minorHAnsi" w:cstheme="minorHAnsi" w:hAnsiTheme="minorHAnsi"/>
         </w:rPr>
       </w:pPr>
-      <w:bookmarkStart w:id="18" w:name="_Toc242430090"/>
-      <w:bookmarkStart w:id="19" w:name="_Toc75855928"/>
+      <w:bookmarkStart w:id="18" w:name="_Toc75855928"/>
+      <w:bookmarkStart w:id="19" w:name="_Toc242430090"/>
       <w:r>
         <w:rPr>
           <w:rFonts w:cs="Calibri" w:cstheme="minorHAnsi"/>
@@ -4207,8 +4207,8 @@
           <w:rFonts w:ascii="Calibri" w:hAnsi="Calibri" w:cs="Calibri" w:asciiTheme="minorHAnsi" w:cstheme="minorHAnsi" w:hAnsiTheme="minorHAnsi"/>
         </w:rPr>
       </w:pPr>
-      <w:bookmarkStart w:id="22" w:name="_Toc242430093"/>
-      <w:bookmarkStart w:id="23" w:name="_Toc75855929"/>
+      <w:bookmarkStart w:id="22" w:name="_Toc75855929"/>
+      <w:bookmarkStart w:id="23" w:name="_Toc242430093"/>
       <w:r>
         <w:rPr>
           <w:rFonts w:cs="Calibri" w:cstheme="minorHAnsi"/>
@@ -4274,8 +4274,8 @@
           <w:rFonts w:ascii="Calibri" w:hAnsi="Calibri" w:cs="Calibri" w:asciiTheme="minorHAnsi" w:cstheme="minorHAnsi" w:hAnsiTheme="minorHAnsi"/>
         </w:rPr>
       </w:pPr>
-      <w:bookmarkStart w:id="26" w:name="_Toc242430093_Copia_1"/>
-      <w:bookmarkStart w:id="27" w:name="_Toc75855929_Copia_1"/>
+      <w:bookmarkStart w:id="26" w:name="_Toc75855929_Copia_1"/>
+      <w:bookmarkStart w:id="27" w:name="_Toc242430093_Copia_1"/>
       <w:r>
         <w:rPr>
           <w:rFonts w:cs="Calibri" w:cstheme="minorHAnsi"/>
@@ -4348,7 +4348,7 @@
           </w:tcPr>
           <w:p>
             <w:pPr>
-              <w:pStyle w:val="Contenidodelatablauser"/>
+              <w:pStyle w:val="Contenidodelatabla"/>
               <w:widowControl w:val="false"/>
               <w:suppressLineNumbers/>
               <w:spacing w:before="0" w:after="120"/>
@@ -4370,7 +4370,7 @@
           </w:tcPr>
           <w:p>
             <w:pPr>
-              <w:pStyle w:val="Contenidodelatablauser"/>
+              <w:pStyle w:val="Contenidodelatabla"/>
               <w:spacing w:lineRule="auto" w:line="276" w:before="0" w:after="120"/>
               <w:rPr>
                 <w:rFonts w:ascii="Calibri" w:hAnsi="Calibri"/>
@@ -4395,7 +4395,7 @@
           </w:tcPr>
           <w:p>
             <w:pPr>
-              <w:pStyle w:val="Contenidodelatablauser"/>
+              <w:pStyle w:val="Contenidodelatabla"/>
               <w:widowControl w:val="false"/>
               <w:suppressLineNumbers/>
               <w:spacing w:before="0" w:after="120"/>
@@ -4417,7 +4417,7 @@
           </w:tcPr>
           <w:p>
             <w:pPr>
-              <w:pStyle w:val="Contenidodelatablauser"/>
+              <w:pStyle w:val="Contenidodelatabla"/>
               <w:spacing w:lineRule="auto" w:line="276" w:before="0" w:after="120"/>
               <w:rPr>
                 <w:rFonts w:ascii="Calibri" w:hAnsi="Calibri"/>
@@ -4442,7 +4442,7 @@
           </w:tcPr>
           <w:p>
             <w:pPr>
-              <w:pStyle w:val="Contenidodelatablauser"/>
+              <w:pStyle w:val="Contenidodelatabla"/>
               <w:spacing w:before="0" w:after="120"/>
               <w:rPr>
                 <w:rFonts w:ascii="Calibri" w:hAnsi="Calibri"/>
@@ -4467,7 +4467,7 @@
           </w:tcPr>
           <w:p>
             <w:pPr>
-              <w:pStyle w:val="Contenidodelatablauser"/>
+              <w:pStyle w:val="Contenidodelatabla"/>
               <w:spacing w:lineRule="auto" w:line="276" w:before="0" w:after="120"/>
               <w:rPr>
                 <w:rFonts w:ascii="Calibri" w:hAnsi="Calibri"/>
@@ -4604,8 +4604,8 @@
           <w:lang w:val="en-US"/>
         </w:rPr>
       </w:pPr>
-      <w:bookmarkStart w:id="31" w:name="_Toc242430097"/>
-      <w:bookmarkStart w:id="32" w:name="_Toc75855931"/>
+      <w:bookmarkStart w:id="31" w:name="_Toc75855931"/>
+      <w:bookmarkStart w:id="32" w:name="_Toc242430097"/>
       <w:r>
         <w:rPr>
           <w:rFonts w:cs="Calibri" w:cstheme="minorHAnsi"/>
@@ -4678,8 +4678,8 @@
           <w:lang w:val="en-US"/>
         </w:rPr>
       </w:pPr>
-      <w:bookmarkStart w:id="34" w:name="_Toc242430099"/>
-      <w:bookmarkStart w:id="35" w:name="_Toc75855932"/>
+      <w:bookmarkStart w:id="34" w:name="_Toc75855932"/>
+      <w:bookmarkStart w:id="35" w:name="_Toc242430099"/>
       <w:r>
         <w:rPr>
           <w:rFonts w:cs="Calibri" w:cstheme="minorHAnsi"/>
@@ -4702,8 +4702,8 @@
           <w:lang w:val="en-US"/>
         </w:rPr>
       </w:pPr>
-      <w:bookmarkStart w:id="36" w:name="_Toc242430100"/>
-      <w:bookmarkStart w:id="37" w:name="_Toc75855933"/>
+      <w:bookmarkStart w:id="36" w:name="_Toc75855933"/>
+      <w:bookmarkStart w:id="37" w:name="_Toc242430100"/>
       <w:r>
         <w:rPr>
           <w:rFonts w:cs="Calibri" w:cstheme="minorHAnsi"/>
@@ -4951,14 +4951,14 @@
       <w:tblLook w:val="04a0" w:firstRow="1" w:noVBand="1" w:lastRow="0" w:firstColumn="1" w:lastColumn="0" w:noHBand="0"/>
     </w:tblPr>
     <w:tblGrid>
-      <w:gridCol w:w="7925"/>
-      <w:gridCol w:w="861"/>
+      <w:gridCol w:w="7924"/>
+      <w:gridCol w:w="862"/>
     </w:tblGrid>
     <w:tr>
       <w:trPr/>
       <w:tc>
         <w:tcPr>
-          <w:tcW w:w="7925" w:type="dxa"/>
+          <w:tcW w:w="7924" w:type="dxa"/>
           <w:tcBorders>
             <w:bottom w:val="single" w:sz="4" w:space="0" w:color="000000"/>
           </w:tcBorders>
@@ -4977,7 +4977,7 @@
       </w:tc>
       <w:tc>
         <w:tcPr>
-          <w:tcW w:w="861" w:type="dxa"/>
+          <w:tcW w:w="862" w:type="dxa"/>
           <w:tcBorders>
             <w:bottom w:val="single" w:sz="4" w:space="0" w:color="000000"/>
           </w:tcBorders>
@@ -5043,14 +5043,14 @@
       <w:tblLook w:val="04a0" w:firstRow="1" w:noVBand="1" w:lastRow="0" w:firstColumn="1" w:lastColumn="0" w:noHBand="0"/>
     </w:tblPr>
     <w:tblGrid>
-      <w:gridCol w:w="7925"/>
-      <w:gridCol w:w="861"/>
+      <w:gridCol w:w="7924"/>
+      <w:gridCol w:w="862"/>
     </w:tblGrid>
     <w:tr>
       <w:trPr/>
       <w:tc>
         <w:tcPr>
-          <w:tcW w:w="7925" w:type="dxa"/>
+          <w:tcW w:w="7924" w:type="dxa"/>
           <w:tcBorders>
             <w:bottom w:val="single" w:sz="4" w:space="0" w:color="000000"/>
           </w:tcBorders>
@@ -5069,7 +5069,7 @@
       </w:tc>
       <w:tc>
         <w:tcPr>
-          <w:tcW w:w="861" w:type="dxa"/>
+          <w:tcW w:w="862" w:type="dxa"/>
           <w:tcBorders>
             <w:bottom w:val="single" w:sz="4" w:space="0" w:color="000000"/>
           </w:tcBorders>
@@ -7133,13 +7133,13 @@
       <w:sz w:val="24"/>
     </w:rPr>
   </w:style>
+  <w:style w:type="character" w:styleId="Enlacedelndiceuser">
+    <w:name w:val="Enlace del índice (user)"/>
+    <w:qFormat/>
+    <w:rPr/>
+  </w:style>
   <w:style w:type="character" w:styleId="Enlacedelndice">
     <w:name w:val="Enlace del índice"/>
-    <w:qFormat/>
-    <w:rPr/>
-  </w:style>
-  <w:style w:type="character" w:styleId="Enlacedelndiceuser">
-    <w:name w:val="Enlace del índice (user)"/>
     <w:qFormat/>
     <w:rPr/>
   </w:style>
@@ -7387,15 +7387,15 @@
       <w:b/>
     </w:rPr>
   </w:style>
-  <w:style w:type="paragraph" w:styleId="Cabeceraypie">
-    <w:name w:val="Cabecera y pie"/>
+  <w:style w:type="paragraph" w:styleId="Cabeceraypieuser">
+    <w:name w:val="Cabecera y pie (user)"/>
     <w:basedOn w:val="Normal"/>
     <w:qFormat/>
     <w:pPr/>
     <w:rPr/>
   </w:style>
-  <w:style w:type="paragraph" w:styleId="Cabeceraypieuser">
-    <w:name w:val="Cabecera y pie (user)"/>
+  <w:style w:type="paragraph" w:styleId="Cabeceraypie">
+    <w:name w:val="Cabecera y pie"/>
     <w:basedOn w:val="Normal"/>
     <w:qFormat/>
     <w:pPr/>
@@ -7639,7 +7639,7 @@
   </w:style>
   <w:style w:type="paragraph" w:styleId="IndexHeading">
     <w:name w:val="index heading"/>
-    <w:basedOn w:val="Ttulo"/>
+    <w:basedOn w:val="Ttulouser"/>
     <w:pPr/>
     <w:rPr/>
   </w:style>
@@ -7709,42 +7709,42 @@
   </w:style>
   <w:style w:type="paragraph" w:styleId="TOC4">
     <w:name w:val="toc 4"/>
-    <w:basedOn w:val="ndice"/>
+    <w:basedOn w:val="ndiceuser"/>
     <w:pPr/>
     <w:rPr/>
   </w:style>
   <w:style w:type="paragraph" w:styleId="TOC5">
     <w:name w:val="toc 5"/>
-    <w:basedOn w:val="ndice"/>
+    <w:basedOn w:val="ndiceuser"/>
     <w:pPr/>
     <w:rPr/>
   </w:style>
   <w:style w:type="paragraph" w:styleId="TOC6">
     <w:name w:val="toc 6"/>
-    <w:basedOn w:val="ndice"/>
+    <w:basedOn w:val="ndiceuser"/>
     <w:pPr/>
     <w:rPr/>
   </w:style>
   <w:style w:type="paragraph" w:styleId="TOC7">
     <w:name w:val="toc 7"/>
-    <w:basedOn w:val="ndice"/>
+    <w:basedOn w:val="ndiceuser"/>
     <w:pPr/>
     <w:rPr/>
   </w:style>
   <w:style w:type="paragraph" w:styleId="TOC8">
     <w:name w:val="toc 8"/>
-    <w:basedOn w:val="ndice"/>
+    <w:basedOn w:val="ndiceuser"/>
     <w:pPr/>
     <w:rPr/>
   </w:style>
   <w:style w:type="paragraph" w:styleId="TOC9">
     <w:name w:val="toc 9"/>
-    <w:basedOn w:val="ndice"/>
+    <w:basedOn w:val="ndiceuser"/>
     <w:pPr/>
     <w:rPr/>
   </w:style>
-  <w:style w:type="paragraph" w:styleId="Contenidodelatablauser">
-    <w:name w:val="Contenido de la tabla (user)"/>
+  <w:style w:type="paragraph" w:styleId="Contenidodelatabla">
+    <w:name w:val="Contenido de la tabla"/>
     <w:basedOn w:val="Normal"/>
     <w:qFormat/>
     <w:pPr>
@@ -7753,9 +7753,9 @@
     </w:pPr>
     <w:rPr/>
   </w:style>
-  <w:style w:type="paragraph" w:styleId="Ttulodelatablauser">
-    <w:name w:val="Título de la tabla (user)"/>
-    <w:basedOn w:val="Contenidodelatablauser"/>
+  <w:style w:type="paragraph" w:styleId="Ttulodelatabla">
+    <w:name w:val="Título de la tabla"/>
+    <w:basedOn w:val="Contenidodelatabla"/>
     <w:qFormat/>
     <w:pPr>
       <w:suppressLineNumbers/>
@@ -7766,8 +7766,8 @@
       <w:bCs/>
     </w:rPr>
   </w:style>
-  <w:style w:type="numbering" w:styleId="Ningunalista" w:default="1">
-    <w:name w:val="Ninguna lista"/>
+  <w:style w:type="numbering" w:styleId="Ningunalistauser" w:default="1">
+    <w:name w:val="Ninguna lista (user)"/>
     <w:uiPriority w:val="99"/>
     <w:semiHidden/>
     <w:unhideWhenUsed/>

</xml_diff>